<commit_message>
3 cereri sql pentru ex 10, ramas de refacut ex 9 BE/Analiza
</commit_message>
<xml_diff>
--- a/DW&BI/GirlsPower_Cristea_Bianca_Analiza.docx
+++ b/DW&BI/GirlsPower_Cristea_Bianca_Analiza.docx
@@ -2627,23 +2627,7 @@
           <w:rFonts w:cstheme="minorHAnsi"/>
           <w:lang w:val="es-ES"/>
         </w:rPr>
-        <w:t xml:space="preserve"> (Cash → Numerar, </w:t>
-      </w:r>
-      <w:proofErr w:type="spellStart"/>
-      <w:r>
-        <w:rPr>
-          <w:rFonts w:cstheme="minorHAnsi"/>
-          <w:lang w:val="es-ES"/>
-        </w:rPr>
-        <w:t>Card</w:t>
-      </w:r>
-      <w:proofErr w:type="spellEnd"/>
-      <w:r>
-        <w:rPr>
-          <w:rFonts w:cstheme="minorHAnsi"/>
-          <w:lang w:val="es-ES"/>
-        </w:rPr>
-        <w:t>/Transfer → Electronic).</w:t>
+        <w:t xml:space="preserve"> (Cash → Numerar, Card/Transfer → Electronic).</w:t>
       </w:r>
     </w:p>
     <w:p>
@@ -3569,37 +3553,12 @@
                 <w:lang w:val="es-ES"/>
               </w:rPr>
             </w:pPr>
-            <w:proofErr w:type="spellStart"/>
             <w:r>
               <w:rPr>
                 <w:rFonts w:cstheme="minorHAnsi"/>
                 <w:lang w:val="es-ES"/>
               </w:rPr>
-              <w:t>Not</w:t>
-            </w:r>
-            <w:proofErr w:type="spellEnd"/>
-            <w:r>
-              <w:rPr>
-                <w:rFonts w:cstheme="minorHAnsi"/>
-                <w:lang w:val="es-ES"/>
-              </w:rPr>
-              <w:t xml:space="preserve"> </w:t>
-            </w:r>
-            <w:proofErr w:type="spellStart"/>
-            <w:r>
-              <w:rPr>
-                <w:rFonts w:cstheme="minorHAnsi"/>
-                <w:lang w:val="es-ES"/>
-              </w:rPr>
-              <w:t>Null</w:t>
-            </w:r>
-            <w:proofErr w:type="spellEnd"/>
-            <w:r>
-              <w:rPr>
-                <w:rFonts w:cstheme="minorHAnsi"/>
-                <w:lang w:val="es-ES"/>
-              </w:rPr>
-              <w:t xml:space="preserve"> </w:t>
+              <w:t xml:space="preserve">Not Null </w:t>
             </w:r>
             <w:proofErr w:type="gramStart"/>
             <w:r>
@@ -3738,21 +3697,12 @@
                 <w:lang w:val="es-ES"/>
               </w:rPr>
             </w:pPr>
-            <w:proofErr w:type="spellStart"/>
             <w:r>
               <w:rPr>
                 <w:rFonts w:cstheme="minorHAnsi"/>
                 <w:lang w:val="es-ES"/>
               </w:rPr>
-              <w:t>Unique</w:t>
-            </w:r>
-            <w:proofErr w:type="spellEnd"/>
-            <w:r>
-              <w:rPr>
-                <w:rFonts w:cstheme="minorHAnsi"/>
-                <w:lang w:val="es-ES"/>
-              </w:rPr>
-              <w:t xml:space="preserve"> – pe </w:t>
+              <w:t xml:space="preserve">Unique – pe </w:t>
             </w:r>
             <w:proofErr w:type="gramStart"/>
             <w:r>
@@ -5924,6 +5874,1089 @@
     </w:p>
     <w:p>
       <w:pPr>
+        <w:tabs>
+          <w:tab w:val="left" w:pos="2206"/>
+        </w:tabs>
+        <w:rPr>
+          <w:rFonts w:cstheme="minorHAnsi"/>
+          <w:lang w:val="ro-RO"/>
+        </w:rPr>
+      </w:pPr>
+    </w:p>
+    <w:p>
+      <w:pPr>
+        <w:numPr>
+          <w:ilvl w:val="0"/>
+          <w:numId w:val="12"/>
+        </w:numPr>
+        <w:rPr>
+          <w:rFonts w:cstheme="minorHAnsi"/>
+        </w:rPr>
+      </w:pPr>
+      <w:r>
+        <w:rPr>
+          <w:rFonts w:cstheme="minorHAnsi"/>
+          <w:b/>
+          <w:bCs/>
+          <w:lang w:val="ro-RO"/>
+        </w:rPr>
+        <w:t xml:space="preserve">(2p) </w:t>
+      </w:r>
+      <w:r>
+        <w:rPr>
+          <w:rFonts w:cstheme="minorHAnsi"/>
+          <w:lang w:val="ro-RO"/>
+        </w:rPr>
+        <w:t>Formularea în limbaj natural a cel puțin 5 cereri, specifice DW, cu grad de</w:t>
+      </w:r>
+      <w:r>
+        <w:rPr>
+          <w:rFonts w:cstheme="minorHAnsi"/>
+        </w:rPr>
+        <w:t> </w:t>
+      </w:r>
+      <w:r>
+        <w:rPr>
+          <w:rFonts w:cstheme="minorHAnsi"/>
+          <w:lang w:val="ro-RO"/>
+        </w:rPr>
+        <w:t>complexitate diferit, concretizate în rapoarte (grafice) ce vor fi create în următoarele etape.</w:t>
+      </w:r>
+      <w:r>
+        <w:rPr>
+          <w:rFonts w:cstheme="minorHAnsi"/>
+        </w:rPr>
+        <w:t> </w:t>
+      </w:r>
+    </w:p>
+    <w:p>
+      <w:pPr>
+        <w:ind w:left="360"/>
+        <w:jc w:val="both"/>
+        <w:rPr>
+          <w:b/>
+          <w:bCs/>
+        </w:rPr>
+      </w:pPr>
+      <w:r>
+        <w:rPr>
+          <w:b/>
+          <w:bCs/>
+        </w:rPr>
+        <w:t>Cerere 1:</w:t>
+      </w:r>
+    </w:p>
+    <w:p>
+      <w:pPr>
+        <w:ind w:left="360"/>
+        <w:jc w:val="both"/>
+      </w:pPr>
+      <w:r>
+        <w:tab/>
+      </w:r>
+      <w:proofErr w:type="spellStart"/>
+      <w:r>
+        <w:t>Afișează</w:t>
+      </w:r>
+      <w:proofErr w:type="spellEnd"/>
+      <w:r>
+        <w:t xml:space="preserve"> </w:t>
+      </w:r>
+      <w:proofErr w:type="spellStart"/>
+      <w:r>
+        <w:t>veniturile</w:t>
+      </w:r>
+      <w:proofErr w:type="spellEnd"/>
+      <w:r>
+        <w:t xml:space="preserve"> </w:t>
+      </w:r>
+      <w:proofErr w:type="spellStart"/>
+      <w:r>
+        <w:t>lunare</w:t>
+      </w:r>
+      <w:proofErr w:type="spellEnd"/>
+      <w:r>
+        <w:t xml:space="preserve"> cumulate </w:t>
+      </w:r>
+      <w:proofErr w:type="spellStart"/>
+      <w:r>
+        <w:t>pentru</w:t>
+      </w:r>
+      <w:proofErr w:type="spellEnd"/>
+      <w:r>
+        <w:t xml:space="preserve"> </w:t>
+      </w:r>
+      <w:proofErr w:type="spellStart"/>
+      <w:r>
+        <w:t>anii</w:t>
+      </w:r>
+      <w:proofErr w:type="spellEnd"/>
+      <w:r>
+        <w:t xml:space="preserve"> 2024 </w:t>
+      </w:r>
+      <w:proofErr w:type="spellStart"/>
+      <w:r>
+        <w:t>și</w:t>
+      </w:r>
+      <w:proofErr w:type="spellEnd"/>
+      <w:r>
+        <w:t xml:space="preserve"> 2025.</w:t>
+      </w:r>
+    </w:p>
+    <w:p>
+      <w:pPr>
+        <w:ind w:firstLine="360"/>
+        <w:jc w:val="both"/>
+        <w:rPr>
+          <w:b/>
+          <w:bCs/>
+        </w:rPr>
+      </w:pPr>
+      <w:proofErr w:type="spellStart"/>
+      <w:r>
+        <w:rPr>
+          <w:b/>
+          <w:bCs/>
+        </w:rPr>
+        <w:t>Reprezentare</w:t>
+      </w:r>
+      <w:proofErr w:type="spellEnd"/>
+      <w:r>
+        <w:rPr>
+          <w:b/>
+          <w:bCs/>
+        </w:rPr>
+        <w:t xml:space="preserve"> </w:t>
+      </w:r>
+      <w:proofErr w:type="spellStart"/>
+      <w:r>
+        <w:rPr>
+          <w:b/>
+          <w:bCs/>
+        </w:rPr>
+        <w:t>grafică</w:t>
+      </w:r>
+      <w:proofErr w:type="spellEnd"/>
+      <w:r>
+        <w:rPr>
+          <w:b/>
+          <w:bCs/>
+        </w:rPr>
+        <w:t>:</w:t>
+      </w:r>
+    </w:p>
+    <w:p>
+      <w:pPr>
+        <w:pStyle w:val="NormalWeb"/>
+        <w:numPr>
+          <w:ilvl w:val="1"/>
+          <w:numId w:val="31"/>
+        </w:numPr>
+        <w:spacing w:before="100" w:beforeAutospacing="1" w:after="100" w:afterAutospacing="1" w:line="240" w:lineRule="auto"/>
+        <w:jc w:val="both"/>
+        <w:rPr>
+          <w:rFonts w:asciiTheme="minorHAnsi" w:hAnsiTheme="minorHAnsi" w:cstheme="minorHAnsi"/>
+          <w:sz w:val="22"/>
+          <w:szCs w:val="22"/>
+        </w:rPr>
+      </w:pPr>
+      <w:proofErr w:type="spellStart"/>
+      <w:r>
+        <w:rPr>
+          <w:rFonts w:asciiTheme="minorHAnsi" w:hAnsiTheme="minorHAnsi" w:cstheme="minorHAnsi"/>
+          <w:b/>
+          <w:bCs/>
+          <w:sz w:val="22"/>
+          <w:szCs w:val="22"/>
+        </w:rPr>
+        <w:t>Grafic</w:t>
+      </w:r>
+      <w:proofErr w:type="spellEnd"/>
+      <w:r>
+        <w:rPr>
+          <w:rFonts w:asciiTheme="minorHAnsi" w:hAnsiTheme="minorHAnsi" w:cstheme="minorHAnsi"/>
+          <w:b/>
+          <w:bCs/>
+          <w:sz w:val="22"/>
+          <w:szCs w:val="22"/>
+        </w:rPr>
+        <w:t xml:space="preserve">: </w:t>
+      </w:r>
+      <w:proofErr w:type="spellStart"/>
+      <w:r>
+        <w:rPr>
+          <w:rFonts w:asciiTheme="minorHAnsi" w:hAnsiTheme="minorHAnsi" w:cstheme="minorHAnsi"/>
+          <w:b/>
+          <w:bCs/>
+          <w:sz w:val="22"/>
+          <w:szCs w:val="22"/>
+        </w:rPr>
+        <w:t>Evoluția</w:t>
+      </w:r>
+      <w:proofErr w:type="spellEnd"/>
+      <w:r>
+        <w:rPr>
+          <w:rFonts w:asciiTheme="minorHAnsi" w:hAnsiTheme="minorHAnsi" w:cstheme="minorHAnsi"/>
+          <w:b/>
+          <w:bCs/>
+          <w:sz w:val="22"/>
+          <w:szCs w:val="22"/>
+        </w:rPr>
+        <w:t xml:space="preserve"> </w:t>
+      </w:r>
+      <w:proofErr w:type="spellStart"/>
+      <w:r>
+        <w:rPr>
+          <w:rFonts w:asciiTheme="minorHAnsi" w:hAnsiTheme="minorHAnsi" w:cstheme="minorHAnsi"/>
+          <w:b/>
+          <w:bCs/>
+          <w:sz w:val="22"/>
+          <w:szCs w:val="22"/>
+        </w:rPr>
+        <w:t>Veniturilor</w:t>
+      </w:r>
+      <w:proofErr w:type="spellEnd"/>
+      <w:r>
+        <w:rPr>
+          <w:rFonts w:asciiTheme="minorHAnsi" w:hAnsiTheme="minorHAnsi" w:cstheme="minorHAnsi"/>
+          <w:b/>
+          <w:bCs/>
+          <w:sz w:val="22"/>
+          <w:szCs w:val="22"/>
+        </w:rPr>
+        <w:t xml:space="preserve"> Cumulate (Grouped Bar Chart)</w:t>
+      </w:r>
+    </w:p>
+    <w:p>
+      <w:pPr>
+        <w:pStyle w:val="NormalWeb"/>
+        <w:numPr>
+          <w:ilvl w:val="0"/>
+          <w:numId w:val="33"/>
+        </w:numPr>
+        <w:spacing w:before="100" w:beforeAutospacing="1" w:after="100" w:afterAutospacing="1" w:line="240" w:lineRule="auto"/>
+        <w:jc w:val="both"/>
+        <w:rPr>
+          <w:rFonts w:asciiTheme="minorHAnsi" w:hAnsiTheme="minorHAnsi" w:cstheme="minorHAnsi"/>
+          <w:sz w:val="22"/>
+          <w:szCs w:val="22"/>
+        </w:rPr>
+      </w:pPr>
+      <w:r>
+        <w:rPr>
+          <w:rFonts w:asciiTheme="minorHAnsi" w:hAnsiTheme="minorHAnsi" w:cstheme="minorHAnsi"/>
+          <w:b/>
+          <w:bCs/>
+          <w:sz w:val="22"/>
+          <w:szCs w:val="22"/>
+        </w:rPr>
+        <w:t>Scop:</w:t>
+      </w:r>
+      <w:r>
+        <w:rPr>
+          <w:rFonts w:asciiTheme="minorHAnsi" w:hAnsiTheme="minorHAnsi" w:cstheme="minorHAnsi"/>
+          <w:sz w:val="22"/>
+          <w:szCs w:val="22"/>
+        </w:rPr>
+        <w:t xml:space="preserve"> </w:t>
+      </w:r>
+      <w:proofErr w:type="spellStart"/>
+      <w:r>
+        <w:rPr>
+          <w:rFonts w:asciiTheme="minorHAnsi" w:hAnsiTheme="minorHAnsi" w:cstheme="minorHAnsi"/>
+          <w:sz w:val="22"/>
+          <w:szCs w:val="22"/>
+        </w:rPr>
+        <w:t>Să</w:t>
+      </w:r>
+      <w:proofErr w:type="spellEnd"/>
+      <w:r>
+        <w:rPr>
+          <w:rFonts w:asciiTheme="minorHAnsi" w:hAnsiTheme="minorHAnsi" w:cstheme="minorHAnsi"/>
+          <w:sz w:val="22"/>
+          <w:szCs w:val="22"/>
+        </w:rPr>
+        <w:t xml:space="preserve"> compare </w:t>
+      </w:r>
+      <w:proofErr w:type="spellStart"/>
+      <w:r>
+        <w:rPr>
+          <w:rFonts w:asciiTheme="minorHAnsi" w:hAnsiTheme="minorHAnsi" w:cstheme="minorHAnsi"/>
+          <w:sz w:val="22"/>
+          <w:szCs w:val="22"/>
+        </w:rPr>
+        <w:t>veniturile</w:t>
+      </w:r>
+      <w:proofErr w:type="spellEnd"/>
+      <w:r>
+        <w:rPr>
+          <w:rFonts w:asciiTheme="minorHAnsi" w:hAnsiTheme="minorHAnsi" w:cstheme="minorHAnsi"/>
+          <w:sz w:val="22"/>
+          <w:szCs w:val="22"/>
+        </w:rPr>
+        <w:t xml:space="preserve"> </w:t>
+      </w:r>
+      <w:proofErr w:type="spellStart"/>
+      <w:r>
+        <w:rPr>
+          <w:rFonts w:asciiTheme="minorHAnsi" w:hAnsiTheme="minorHAnsi" w:cstheme="minorHAnsi"/>
+          <w:sz w:val="22"/>
+          <w:szCs w:val="22"/>
+        </w:rPr>
+        <w:t>totale</w:t>
+      </w:r>
+      <w:proofErr w:type="spellEnd"/>
+      <w:r>
+        <w:rPr>
+          <w:rFonts w:asciiTheme="minorHAnsi" w:hAnsiTheme="minorHAnsi" w:cstheme="minorHAnsi"/>
+          <w:sz w:val="22"/>
+          <w:szCs w:val="22"/>
+        </w:rPr>
+        <w:t xml:space="preserve"> cumulate de la </w:t>
+      </w:r>
+      <w:proofErr w:type="spellStart"/>
+      <w:r>
+        <w:rPr>
+          <w:rFonts w:asciiTheme="minorHAnsi" w:hAnsiTheme="minorHAnsi" w:cstheme="minorHAnsi"/>
+          <w:sz w:val="22"/>
+          <w:szCs w:val="22"/>
+        </w:rPr>
+        <w:t>începutul</w:t>
+      </w:r>
+      <w:proofErr w:type="spellEnd"/>
+      <w:r>
+        <w:rPr>
+          <w:rFonts w:asciiTheme="minorHAnsi" w:hAnsiTheme="minorHAnsi" w:cstheme="minorHAnsi"/>
+          <w:sz w:val="22"/>
+          <w:szCs w:val="22"/>
+        </w:rPr>
+        <w:t xml:space="preserve"> </w:t>
+      </w:r>
+      <w:proofErr w:type="spellStart"/>
+      <w:r>
+        <w:rPr>
+          <w:rFonts w:asciiTheme="minorHAnsi" w:hAnsiTheme="minorHAnsi" w:cstheme="minorHAnsi"/>
+          <w:sz w:val="22"/>
+          <w:szCs w:val="22"/>
+        </w:rPr>
+        <w:t>anului</w:t>
+      </w:r>
+      <w:proofErr w:type="spellEnd"/>
+      <w:r>
+        <w:rPr>
+          <w:rFonts w:asciiTheme="minorHAnsi" w:hAnsiTheme="minorHAnsi" w:cstheme="minorHAnsi"/>
+          <w:sz w:val="22"/>
+          <w:szCs w:val="22"/>
+        </w:rPr>
+        <w:t xml:space="preserve"> </w:t>
+      </w:r>
+      <w:proofErr w:type="spellStart"/>
+      <w:r>
+        <w:rPr>
+          <w:rFonts w:asciiTheme="minorHAnsi" w:hAnsiTheme="minorHAnsi" w:cstheme="minorHAnsi"/>
+          <w:sz w:val="22"/>
+          <w:szCs w:val="22"/>
+        </w:rPr>
+        <w:t>până</w:t>
+      </w:r>
+      <w:proofErr w:type="spellEnd"/>
+      <w:r>
+        <w:rPr>
+          <w:rFonts w:asciiTheme="minorHAnsi" w:hAnsiTheme="minorHAnsi" w:cstheme="minorHAnsi"/>
+          <w:sz w:val="22"/>
+          <w:szCs w:val="22"/>
+        </w:rPr>
+        <w:t xml:space="preserve"> </w:t>
+      </w:r>
+      <w:proofErr w:type="spellStart"/>
+      <w:r>
+        <w:rPr>
+          <w:rFonts w:asciiTheme="minorHAnsi" w:hAnsiTheme="minorHAnsi" w:cstheme="minorHAnsi"/>
+          <w:sz w:val="22"/>
+          <w:szCs w:val="22"/>
+        </w:rPr>
+        <w:t>în</w:t>
+      </w:r>
+      <w:proofErr w:type="spellEnd"/>
+      <w:r>
+        <w:rPr>
+          <w:rFonts w:asciiTheme="minorHAnsi" w:hAnsiTheme="minorHAnsi" w:cstheme="minorHAnsi"/>
+          <w:sz w:val="22"/>
+          <w:szCs w:val="22"/>
+        </w:rPr>
+        <w:t xml:space="preserve"> luna </w:t>
+      </w:r>
+      <w:proofErr w:type="spellStart"/>
+      <w:r>
+        <w:rPr>
+          <w:rFonts w:asciiTheme="minorHAnsi" w:hAnsiTheme="minorHAnsi" w:cstheme="minorHAnsi"/>
+          <w:sz w:val="22"/>
+          <w:szCs w:val="22"/>
+        </w:rPr>
+        <w:t>curentă</w:t>
+      </w:r>
+      <w:proofErr w:type="spellEnd"/>
+      <w:r>
+        <w:rPr>
+          <w:rFonts w:asciiTheme="minorHAnsi" w:hAnsiTheme="minorHAnsi" w:cstheme="minorHAnsi"/>
+          <w:sz w:val="22"/>
+          <w:szCs w:val="22"/>
+        </w:rPr>
+        <w:t xml:space="preserve">, </w:t>
+      </w:r>
+      <w:proofErr w:type="spellStart"/>
+      <w:r>
+        <w:rPr>
+          <w:rFonts w:asciiTheme="minorHAnsi" w:hAnsiTheme="minorHAnsi" w:cstheme="minorHAnsi"/>
+          <w:sz w:val="22"/>
+          <w:szCs w:val="22"/>
+        </w:rPr>
+        <w:t>între</w:t>
+      </w:r>
+      <w:proofErr w:type="spellEnd"/>
+      <w:r>
+        <w:rPr>
+          <w:rFonts w:asciiTheme="minorHAnsi" w:hAnsiTheme="minorHAnsi" w:cstheme="minorHAnsi"/>
+          <w:sz w:val="22"/>
+          <w:szCs w:val="22"/>
+        </w:rPr>
+        <w:t xml:space="preserve"> </w:t>
+      </w:r>
+      <w:proofErr w:type="spellStart"/>
+      <w:r>
+        <w:rPr>
+          <w:rFonts w:asciiTheme="minorHAnsi" w:hAnsiTheme="minorHAnsi" w:cstheme="minorHAnsi"/>
+          <w:sz w:val="22"/>
+          <w:szCs w:val="22"/>
+        </w:rPr>
+        <w:t>anul</w:t>
+      </w:r>
+      <w:proofErr w:type="spellEnd"/>
+      <w:r>
+        <w:rPr>
+          <w:rFonts w:asciiTheme="minorHAnsi" w:hAnsiTheme="minorHAnsi" w:cstheme="minorHAnsi"/>
+          <w:sz w:val="22"/>
+          <w:szCs w:val="22"/>
+        </w:rPr>
+        <w:t xml:space="preserve"> 2024 </w:t>
+      </w:r>
+      <w:proofErr w:type="spellStart"/>
+      <w:r>
+        <w:rPr>
+          <w:rFonts w:asciiTheme="minorHAnsi" w:hAnsiTheme="minorHAnsi" w:cstheme="minorHAnsi"/>
+          <w:sz w:val="22"/>
+          <w:szCs w:val="22"/>
+        </w:rPr>
+        <w:t>și</w:t>
+      </w:r>
+      <w:proofErr w:type="spellEnd"/>
+      <w:r>
+        <w:rPr>
+          <w:rFonts w:asciiTheme="minorHAnsi" w:hAnsiTheme="minorHAnsi" w:cstheme="minorHAnsi"/>
+          <w:sz w:val="22"/>
+          <w:szCs w:val="22"/>
+        </w:rPr>
+        <w:t xml:space="preserve"> 2025. </w:t>
+      </w:r>
+    </w:p>
+    <w:p>
+      <w:pPr>
+        <w:pStyle w:val="NormalWeb"/>
+        <w:numPr>
+          <w:ilvl w:val="0"/>
+          <w:numId w:val="33"/>
+        </w:numPr>
+        <w:spacing w:before="100" w:beforeAutospacing="1" w:after="100" w:afterAutospacing="1" w:line="240" w:lineRule="auto"/>
+        <w:jc w:val="both"/>
+        <w:rPr>
+          <w:rFonts w:asciiTheme="minorHAnsi" w:hAnsiTheme="minorHAnsi" w:cstheme="minorHAnsi"/>
+          <w:sz w:val="22"/>
+          <w:szCs w:val="22"/>
+        </w:rPr>
+      </w:pPr>
+      <w:r>
+        <w:rPr>
+          <w:rFonts w:asciiTheme="minorHAnsi" w:hAnsiTheme="minorHAnsi" w:cstheme="minorHAnsi"/>
+          <w:b/>
+          <w:bCs/>
+          <w:sz w:val="22"/>
+          <w:szCs w:val="22"/>
+        </w:rPr>
+        <w:t>Axa X (</w:t>
+      </w:r>
+      <w:proofErr w:type="spellStart"/>
+      <w:r>
+        <w:rPr>
+          <w:rFonts w:asciiTheme="minorHAnsi" w:hAnsiTheme="minorHAnsi" w:cstheme="minorHAnsi"/>
+          <w:b/>
+          <w:bCs/>
+          <w:sz w:val="22"/>
+          <w:szCs w:val="22"/>
+        </w:rPr>
+        <w:t>Orizontală</w:t>
+      </w:r>
+      <w:proofErr w:type="spellEnd"/>
+      <w:r>
+        <w:rPr>
+          <w:rFonts w:asciiTheme="minorHAnsi" w:hAnsiTheme="minorHAnsi" w:cstheme="minorHAnsi"/>
+          <w:b/>
+          <w:bCs/>
+          <w:sz w:val="22"/>
+          <w:szCs w:val="22"/>
+        </w:rPr>
+        <w:t>):</w:t>
+      </w:r>
+      <w:r>
+        <w:rPr>
+          <w:rFonts w:asciiTheme="minorHAnsi" w:hAnsiTheme="minorHAnsi" w:cstheme="minorHAnsi"/>
+          <w:sz w:val="22"/>
+          <w:szCs w:val="22"/>
+        </w:rPr>
+        <w:t xml:space="preserve"> Lunile </w:t>
+      </w:r>
+      <w:proofErr w:type="spellStart"/>
+      <w:r>
+        <w:rPr>
+          <w:rFonts w:asciiTheme="minorHAnsi" w:hAnsiTheme="minorHAnsi" w:cstheme="minorHAnsi"/>
+          <w:sz w:val="22"/>
+          <w:szCs w:val="22"/>
+        </w:rPr>
+        <w:t>anului</w:t>
+      </w:r>
+      <w:proofErr w:type="spellEnd"/>
+      <w:r>
+        <w:rPr>
+          <w:rFonts w:asciiTheme="minorHAnsi" w:hAnsiTheme="minorHAnsi" w:cstheme="minorHAnsi"/>
+          <w:sz w:val="22"/>
+          <w:szCs w:val="22"/>
+        </w:rPr>
+        <w:t xml:space="preserve"> (Ian - Dec).</w:t>
+      </w:r>
+    </w:p>
+    <w:p>
+      <w:pPr>
+        <w:pStyle w:val="NormalWeb"/>
+        <w:numPr>
+          <w:ilvl w:val="0"/>
+          <w:numId w:val="33"/>
+        </w:numPr>
+        <w:spacing w:before="100" w:beforeAutospacing="1" w:after="100" w:afterAutospacing="1" w:line="240" w:lineRule="auto"/>
+        <w:jc w:val="both"/>
+        <w:rPr>
+          <w:rFonts w:asciiTheme="minorHAnsi" w:hAnsiTheme="minorHAnsi" w:cstheme="minorHAnsi"/>
+          <w:sz w:val="22"/>
+          <w:szCs w:val="22"/>
+        </w:rPr>
+      </w:pPr>
+      <w:r>
+        <w:rPr>
+          <w:rFonts w:asciiTheme="minorHAnsi" w:hAnsiTheme="minorHAnsi" w:cstheme="minorHAnsi"/>
+          <w:b/>
+          <w:bCs/>
+          <w:sz w:val="22"/>
+          <w:szCs w:val="22"/>
+        </w:rPr>
+        <w:t>Axa Y (</w:t>
+      </w:r>
+      <w:proofErr w:type="spellStart"/>
+      <w:r>
+        <w:rPr>
+          <w:rFonts w:asciiTheme="minorHAnsi" w:hAnsiTheme="minorHAnsi" w:cstheme="minorHAnsi"/>
+          <w:b/>
+          <w:bCs/>
+          <w:sz w:val="22"/>
+          <w:szCs w:val="22"/>
+        </w:rPr>
+        <w:t>Verticală</w:t>
+      </w:r>
+      <w:proofErr w:type="spellEnd"/>
+      <w:r>
+        <w:rPr>
+          <w:rFonts w:asciiTheme="minorHAnsi" w:hAnsiTheme="minorHAnsi" w:cstheme="minorHAnsi"/>
+          <w:b/>
+          <w:bCs/>
+          <w:sz w:val="22"/>
+          <w:szCs w:val="22"/>
+        </w:rPr>
+        <w:t>):</w:t>
+      </w:r>
+      <w:r>
+        <w:rPr>
+          <w:rFonts w:asciiTheme="minorHAnsi" w:hAnsiTheme="minorHAnsi" w:cstheme="minorHAnsi"/>
+          <w:sz w:val="22"/>
+          <w:szCs w:val="22"/>
+        </w:rPr>
+        <w:t xml:space="preserve"> Valori </w:t>
+      </w:r>
+      <w:proofErr w:type="spellStart"/>
+      <w:r>
+        <w:rPr>
+          <w:rFonts w:asciiTheme="minorHAnsi" w:hAnsiTheme="minorHAnsi" w:cstheme="minorHAnsi"/>
+          <w:sz w:val="22"/>
+          <w:szCs w:val="22"/>
+        </w:rPr>
+        <w:t>numerice</w:t>
+      </w:r>
+      <w:proofErr w:type="spellEnd"/>
+      <w:r>
+        <w:rPr>
+          <w:rFonts w:asciiTheme="minorHAnsi" w:hAnsiTheme="minorHAnsi" w:cstheme="minorHAnsi"/>
+          <w:sz w:val="22"/>
+          <w:szCs w:val="22"/>
+        </w:rPr>
+        <w:t xml:space="preserve"> </w:t>
+      </w:r>
+      <w:proofErr w:type="spellStart"/>
+      <w:r>
+        <w:rPr>
+          <w:rFonts w:asciiTheme="minorHAnsi" w:hAnsiTheme="minorHAnsi" w:cstheme="minorHAnsi"/>
+          <w:sz w:val="22"/>
+          <w:szCs w:val="22"/>
+        </w:rPr>
+        <w:t>reprezentând</w:t>
+      </w:r>
+      <w:proofErr w:type="spellEnd"/>
+      <w:r>
+        <w:rPr>
+          <w:rFonts w:asciiTheme="minorHAnsi" w:hAnsiTheme="minorHAnsi" w:cstheme="minorHAnsi"/>
+          <w:sz w:val="22"/>
+          <w:szCs w:val="22"/>
+        </w:rPr>
+        <w:t xml:space="preserve"> </w:t>
+      </w:r>
+      <w:proofErr w:type="spellStart"/>
+      <w:r>
+        <w:rPr>
+          <w:rFonts w:asciiTheme="minorHAnsi" w:hAnsiTheme="minorHAnsi" w:cstheme="minorHAnsi"/>
+          <w:sz w:val="22"/>
+          <w:szCs w:val="22"/>
+        </w:rPr>
+        <w:t>suma</w:t>
+      </w:r>
+      <w:proofErr w:type="spellEnd"/>
+      <w:r>
+        <w:rPr>
+          <w:rFonts w:asciiTheme="minorHAnsi" w:hAnsiTheme="minorHAnsi" w:cstheme="minorHAnsi"/>
+          <w:sz w:val="22"/>
+          <w:szCs w:val="22"/>
+        </w:rPr>
+        <w:t xml:space="preserve"> </w:t>
+      </w:r>
+      <w:proofErr w:type="spellStart"/>
+      <w:r>
+        <w:rPr>
+          <w:rFonts w:asciiTheme="minorHAnsi" w:hAnsiTheme="minorHAnsi" w:cstheme="minorHAnsi"/>
+          <w:sz w:val="22"/>
+          <w:szCs w:val="22"/>
+        </w:rPr>
+        <w:t>totală</w:t>
+      </w:r>
+      <w:proofErr w:type="spellEnd"/>
+      <w:r>
+        <w:rPr>
+          <w:rFonts w:asciiTheme="minorHAnsi" w:hAnsiTheme="minorHAnsi" w:cstheme="minorHAnsi"/>
+          <w:sz w:val="22"/>
+          <w:szCs w:val="22"/>
+        </w:rPr>
+        <w:t xml:space="preserve"> </w:t>
+      </w:r>
+      <w:proofErr w:type="spellStart"/>
+      <w:r>
+        <w:rPr>
+          <w:rFonts w:asciiTheme="minorHAnsi" w:hAnsiTheme="minorHAnsi" w:cstheme="minorHAnsi"/>
+          <w:sz w:val="22"/>
+          <w:szCs w:val="22"/>
+        </w:rPr>
+        <w:t>cumulată</w:t>
+      </w:r>
+      <w:proofErr w:type="spellEnd"/>
+      <w:r>
+        <w:rPr>
+          <w:rFonts w:asciiTheme="minorHAnsi" w:hAnsiTheme="minorHAnsi" w:cstheme="minorHAnsi"/>
+          <w:sz w:val="22"/>
+          <w:szCs w:val="22"/>
+        </w:rPr>
+        <w:t xml:space="preserve">. </w:t>
+      </w:r>
+    </w:p>
+    <w:p>
+      <w:pPr>
+        <w:pStyle w:val="NormalWeb"/>
+        <w:numPr>
+          <w:ilvl w:val="0"/>
+          <w:numId w:val="33"/>
+        </w:numPr>
+        <w:spacing w:before="100" w:beforeAutospacing="1" w:after="100" w:afterAutospacing="1" w:line="240" w:lineRule="auto"/>
+        <w:jc w:val="both"/>
+        <w:rPr>
+          <w:rFonts w:asciiTheme="minorHAnsi" w:hAnsiTheme="minorHAnsi" w:cstheme="minorHAnsi"/>
+          <w:sz w:val="22"/>
+          <w:szCs w:val="22"/>
+        </w:rPr>
+      </w:pPr>
+      <w:proofErr w:type="spellStart"/>
+      <w:r>
+        <w:rPr>
+          <w:rFonts w:asciiTheme="minorHAnsi" w:hAnsiTheme="minorHAnsi" w:cstheme="minorHAnsi"/>
+          <w:b/>
+          <w:bCs/>
+          <w:sz w:val="22"/>
+          <w:szCs w:val="22"/>
+        </w:rPr>
+        <w:t>Reprezentare</w:t>
+      </w:r>
+      <w:proofErr w:type="spellEnd"/>
+      <w:r>
+        <w:rPr>
+          <w:rFonts w:asciiTheme="minorHAnsi" w:hAnsiTheme="minorHAnsi" w:cstheme="minorHAnsi"/>
+          <w:b/>
+          <w:bCs/>
+          <w:sz w:val="22"/>
+          <w:szCs w:val="22"/>
+        </w:rPr>
+        <w:t>:</w:t>
+      </w:r>
+    </w:p>
+    <w:p>
+      <w:pPr>
+        <w:pStyle w:val="NormalWeb"/>
+        <w:numPr>
+          <w:ilvl w:val="1"/>
+          <w:numId w:val="33"/>
+        </w:numPr>
+        <w:spacing w:before="100" w:beforeAutospacing="1" w:after="100" w:afterAutospacing="1" w:line="240" w:lineRule="auto"/>
+        <w:jc w:val="both"/>
+        <w:rPr>
+          <w:rFonts w:asciiTheme="minorHAnsi" w:hAnsiTheme="minorHAnsi" w:cstheme="minorHAnsi"/>
+          <w:sz w:val="22"/>
+          <w:szCs w:val="22"/>
+        </w:rPr>
+      </w:pPr>
+      <w:r>
+        <w:rPr>
+          <w:rFonts w:asciiTheme="minorHAnsi" w:hAnsiTheme="minorHAnsi" w:cstheme="minorHAnsi"/>
+          <w:b/>
+          <w:bCs/>
+          <w:sz w:val="22"/>
+          <w:szCs w:val="22"/>
+        </w:rPr>
+        <w:t xml:space="preserve">Bare </w:t>
+      </w:r>
+      <w:proofErr w:type="spellStart"/>
+      <w:r>
+        <w:rPr>
+          <w:rFonts w:asciiTheme="minorHAnsi" w:hAnsiTheme="minorHAnsi" w:cstheme="minorHAnsi"/>
+          <w:b/>
+          <w:bCs/>
+          <w:sz w:val="22"/>
+          <w:szCs w:val="22"/>
+        </w:rPr>
+        <w:t>Grupate</w:t>
+      </w:r>
+      <w:proofErr w:type="spellEnd"/>
+      <w:r>
+        <w:rPr>
+          <w:rFonts w:asciiTheme="minorHAnsi" w:hAnsiTheme="minorHAnsi" w:cstheme="minorHAnsi"/>
+          <w:b/>
+          <w:bCs/>
+          <w:sz w:val="22"/>
+          <w:szCs w:val="22"/>
+        </w:rPr>
+        <w:t>:</w:t>
+      </w:r>
+      <w:r>
+        <w:rPr>
+          <w:rFonts w:asciiTheme="minorHAnsi" w:hAnsiTheme="minorHAnsi" w:cstheme="minorHAnsi"/>
+          <w:sz w:val="22"/>
+          <w:szCs w:val="22"/>
+        </w:rPr>
+        <w:t xml:space="preserve"> </w:t>
+      </w:r>
+      <w:proofErr w:type="spellStart"/>
+      <w:r>
+        <w:rPr>
+          <w:rFonts w:asciiTheme="minorHAnsi" w:hAnsiTheme="minorHAnsi" w:cstheme="minorHAnsi"/>
+          <w:sz w:val="22"/>
+          <w:szCs w:val="22"/>
+        </w:rPr>
+        <w:t>Pentru</w:t>
+      </w:r>
+      <w:proofErr w:type="spellEnd"/>
+      <w:r>
+        <w:rPr>
+          <w:rFonts w:asciiTheme="minorHAnsi" w:hAnsiTheme="minorHAnsi" w:cstheme="minorHAnsi"/>
+          <w:sz w:val="22"/>
+          <w:szCs w:val="22"/>
+        </w:rPr>
+        <w:t xml:space="preserve"> </w:t>
+      </w:r>
+      <w:proofErr w:type="spellStart"/>
+      <w:r>
+        <w:rPr>
+          <w:rFonts w:asciiTheme="minorHAnsi" w:hAnsiTheme="minorHAnsi" w:cstheme="minorHAnsi"/>
+          <w:sz w:val="22"/>
+          <w:szCs w:val="22"/>
+        </w:rPr>
+        <w:t>fiecare</w:t>
+      </w:r>
+      <w:proofErr w:type="spellEnd"/>
+      <w:r>
+        <w:rPr>
+          <w:rFonts w:asciiTheme="minorHAnsi" w:hAnsiTheme="minorHAnsi" w:cstheme="minorHAnsi"/>
+          <w:sz w:val="22"/>
+          <w:szCs w:val="22"/>
+        </w:rPr>
+        <w:t xml:space="preserve"> </w:t>
+      </w:r>
+      <w:proofErr w:type="spellStart"/>
+      <w:r>
+        <w:rPr>
+          <w:rFonts w:asciiTheme="minorHAnsi" w:hAnsiTheme="minorHAnsi" w:cstheme="minorHAnsi"/>
+          <w:sz w:val="22"/>
+          <w:szCs w:val="22"/>
+        </w:rPr>
+        <w:t>lună</w:t>
+      </w:r>
+      <w:proofErr w:type="spellEnd"/>
+      <w:r>
+        <w:rPr>
+          <w:rFonts w:asciiTheme="minorHAnsi" w:hAnsiTheme="minorHAnsi" w:cstheme="minorHAnsi"/>
+          <w:sz w:val="22"/>
+          <w:szCs w:val="22"/>
+        </w:rPr>
+        <w:t xml:space="preserve"> </w:t>
+      </w:r>
+      <w:proofErr w:type="spellStart"/>
+      <w:r>
+        <w:rPr>
+          <w:rFonts w:asciiTheme="minorHAnsi" w:hAnsiTheme="minorHAnsi" w:cstheme="minorHAnsi"/>
+          <w:sz w:val="22"/>
+          <w:szCs w:val="22"/>
+        </w:rPr>
+        <w:t>există</w:t>
+      </w:r>
+      <w:proofErr w:type="spellEnd"/>
+      <w:r>
+        <w:rPr>
+          <w:rFonts w:asciiTheme="minorHAnsi" w:hAnsiTheme="minorHAnsi" w:cstheme="minorHAnsi"/>
+          <w:sz w:val="22"/>
+          <w:szCs w:val="22"/>
+        </w:rPr>
+        <w:t xml:space="preserve"> </w:t>
+      </w:r>
+      <w:proofErr w:type="spellStart"/>
+      <w:r>
+        <w:rPr>
+          <w:rFonts w:asciiTheme="minorHAnsi" w:hAnsiTheme="minorHAnsi" w:cstheme="minorHAnsi"/>
+          <w:sz w:val="22"/>
+          <w:szCs w:val="22"/>
+        </w:rPr>
+        <w:t>două</w:t>
+      </w:r>
+      <w:proofErr w:type="spellEnd"/>
+      <w:r>
+        <w:rPr>
+          <w:rFonts w:asciiTheme="minorHAnsi" w:hAnsiTheme="minorHAnsi" w:cstheme="minorHAnsi"/>
+          <w:sz w:val="22"/>
+          <w:szCs w:val="22"/>
+        </w:rPr>
+        <w:t xml:space="preserve"> bare </w:t>
+      </w:r>
+      <w:proofErr w:type="spellStart"/>
+      <w:r>
+        <w:rPr>
+          <w:rFonts w:asciiTheme="minorHAnsi" w:hAnsiTheme="minorHAnsi" w:cstheme="minorHAnsi"/>
+          <w:sz w:val="22"/>
+          <w:szCs w:val="22"/>
+        </w:rPr>
+        <w:t>alăturate</w:t>
+      </w:r>
+      <w:proofErr w:type="spellEnd"/>
+      <w:r>
+        <w:rPr>
+          <w:rFonts w:asciiTheme="minorHAnsi" w:hAnsiTheme="minorHAnsi" w:cstheme="minorHAnsi"/>
+          <w:sz w:val="22"/>
+          <w:szCs w:val="22"/>
+        </w:rPr>
+        <w:t>.</w:t>
+      </w:r>
+    </w:p>
+    <w:p>
+      <w:pPr>
+        <w:pStyle w:val="NormalWeb"/>
+        <w:numPr>
+          <w:ilvl w:val="1"/>
+          <w:numId w:val="33"/>
+        </w:numPr>
+        <w:spacing w:before="100" w:beforeAutospacing="1" w:after="100" w:afterAutospacing="1" w:line="240" w:lineRule="auto"/>
+        <w:jc w:val="both"/>
+        <w:rPr>
+          <w:rFonts w:asciiTheme="minorHAnsi" w:hAnsiTheme="minorHAnsi" w:cstheme="minorHAnsi"/>
+          <w:sz w:val="22"/>
+          <w:szCs w:val="22"/>
+        </w:rPr>
+      </w:pPr>
+      <w:r>
+        <w:rPr>
+          <w:rFonts w:asciiTheme="minorHAnsi" w:hAnsiTheme="minorHAnsi" w:cstheme="minorHAnsi"/>
+          <w:b/>
+          <w:bCs/>
+          <w:sz w:val="22"/>
+          <w:szCs w:val="22"/>
+        </w:rPr>
+        <w:t>Bara 1:</w:t>
+      </w:r>
+      <w:r>
+        <w:rPr>
+          <w:rFonts w:asciiTheme="minorHAnsi" w:hAnsiTheme="minorHAnsi" w:cstheme="minorHAnsi"/>
+          <w:sz w:val="22"/>
+          <w:szCs w:val="22"/>
+        </w:rPr>
+        <w:t xml:space="preserve"> </w:t>
+      </w:r>
+      <w:proofErr w:type="spellStart"/>
+      <w:r>
+        <w:rPr>
+          <w:rFonts w:asciiTheme="minorHAnsi" w:hAnsiTheme="minorHAnsi" w:cstheme="minorHAnsi"/>
+          <w:sz w:val="22"/>
+          <w:szCs w:val="22"/>
+        </w:rPr>
+        <w:t>anul</w:t>
+      </w:r>
+      <w:proofErr w:type="spellEnd"/>
+      <w:r>
+        <w:rPr>
+          <w:rFonts w:asciiTheme="minorHAnsi" w:hAnsiTheme="minorHAnsi" w:cstheme="minorHAnsi"/>
+          <w:sz w:val="22"/>
+          <w:szCs w:val="22"/>
+        </w:rPr>
+        <w:t xml:space="preserve"> </w:t>
+      </w:r>
+      <w:proofErr w:type="spellStart"/>
+      <w:r>
+        <w:rPr>
+          <w:rFonts w:asciiTheme="minorHAnsi" w:hAnsiTheme="minorHAnsi" w:cstheme="minorHAnsi"/>
+          <w:sz w:val="22"/>
+          <w:szCs w:val="22"/>
+        </w:rPr>
+        <w:t>trecut</w:t>
+      </w:r>
+      <w:proofErr w:type="spellEnd"/>
+      <w:r>
+        <w:rPr>
+          <w:rFonts w:asciiTheme="minorHAnsi" w:hAnsiTheme="minorHAnsi" w:cstheme="minorHAnsi"/>
+          <w:sz w:val="22"/>
+          <w:szCs w:val="22"/>
+        </w:rPr>
+        <w:t>, 2024</w:t>
+      </w:r>
+    </w:p>
+    <w:p>
+      <w:pPr>
+        <w:pStyle w:val="NormalWeb"/>
+        <w:numPr>
+          <w:ilvl w:val="1"/>
+          <w:numId w:val="33"/>
+        </w:numPr>
+        <w:spacing w:before="100" w:beforeAutospacing="1" w:after="100" w:afterAutospacing="1" w:line="240" w:lineRule="auto"/>
+        <w:jc w:val="both"/>
+        <w:rPr>
+          <w:rFonts w:asciiTheme="minorHAnsi" w:hAnsiTheme="minorHAnsi" w:cstheme="minorHAnsi"/>
+          <w:sz w:val="22"/>
+          <w:szCs w:val="22"/>
+        </w:rPr>
+      </w:pPr>
+      <w:r>
+        <w:rPr>
+          <w:rFonts w:asciiTheme="minorHAnsi" w:hAnsiTheme="minorHAnsi" w:cstheme="minorHAnsi"/>
+          <w:b/>
+          <w:bCs/>
+          <w:sz w:val="22"/>
+          <w:szCs w:val="22"/>
+        </w:rPr>
+        <w:t xml:space="preserve">Bara 2: </w:t>
+      </w:r>
+      <w:proofErr w:type="spellStart"/>
+      <w:r>
+        <w:rPr>
+          <w:rFonts w:asciiTheme="minorHAnsi" w:hAnsiTheme="minorHAnsi" w:cstheme="minorHAnsi"/>
+          <w:sz w:val="22"/>
+          <w:szCs w:val="22"/>
+        </w:rPr>
+        <w:t>anul</w:t>
+      </w:r>
+      <w:proofErr w:type="spellEnd"/>
+      <w:r>
+        <w:rPr>
+          <w:rFonts w:asciiTheme="minorHAnsi" w:hAnsiTheme="minorHAnsi" w:cstheme="minorHAnsi"/>
+          <w:sz w:val="22"/>
+          <w:szCs w:val="22"/>
+        </w:rPr>
+        <w:t xml:space="preserve"> </w:t>
+      </w:r>
+      <w:proofErr w:type="spellStart"/>
+      <w:r>
+        <w:rPr>
+          <w:rFonts w:asciiTheme="minorHAnsi" w:hAnsiTheme="minorHAnsi" w:cstheme="minorHAnsi"/>
+          <w:sz w:val="22"/>
+          <w:szCs w:val="22"/>
+        </w:rPr>
+        <w:t>curent</w:t>
+      </w:r>
+      <w:proofErr w:type="spellEnd"/>
+      <w:r>
+        <w:rPr>
+          <w:rFonts w:asciiTheme="minorHAnsi" w:hAnsiTheme="minorHAnsi" w:cstheme="minorHAnsi"/>
+          <w:sz w:val="22"/>
+          <w:szCs w:val="22"/>
+        </w:rPr>
+        <w:t>, 2025</w:t>
+      </w:r>
+    </w:p>
+    <w:p>
+      <w:pPr>
+        <w:pStyle w:val="NormalWeb"/>
+        <w:jc w:val="both"/>
+        <w:rPr>
+          <w:rFonts w:asciiTheme="majorHAnsi" w:hAnsiTheme="majorHAnsi" w:cstheme="majorHAnsi"/>
+          <w:sz w:val="22"/>
+          <w:szCs w:val="22"/>
+        </w:rPr>
+      </w:pPr>
+    </w:p>
+    <w:p>
+      <w:pPr>
+        <w:ind w:left="360"/>
+        <w:jc w:val="both"/>
+        <w:rPr>
+          <w:b/>
+          <w:bCs/>
+        </w:rPr>
+      </w:pPr>
+      <w:r>
+        <w:rPr>
+          <w:b/>
+          <w:bCs/>
+        </w:rPr>
+        <w:t xml:space="preserve">Cerere </w:t>
+      </w:r>
+      <w:r>
+        <w:rPr>
+          <w:b/>
+          <w:bCs/>
+        </w:rPr>
+        <w:t>2</w:t>
+      </w:r>
+      <w:r>
+        <w:rPr>
+          <w:b/>
+          <w:bCs/>
+        </w:rPr>
+        <w:t>:</w:t>
+      </w:r>
+    </w:p>
+    <w:p>
+      <w:pPr>
         <w:ind w:left="720"/>
         <w:jc w:val="both"/>
       </w:pPr>
@@ -5945,6 +6978,33 @@
       </w:r>
       <w:proofErr w:type="spellStart"/>
       <w:r>
+        <w:t>dintre</w:t>
+      </w:r>
+      <w:proofErr w:type="spellEnd"/>
+      <w:r>
+        <w:t xml:space="preserve"> camera, </w:t>
+      </w:r>
+      <w:proofErr w:type="spellStart"/>
+      <w:r>
+        <w:t>p</w:t>
+      </w:r>
+      <w:r>
+        <w:t>entru</w:t>
+      </w:r>
+      <w:proofErr w:type="spellEnd"/>
+      <w:r>
+        <w:t xml:space="preserve"> </w:t>
+      </w:r>
+      <w:proofErr w:type="spellStart"/>
+      <w:r>
+        <w:t>fiecare</w:t>
+      </w:r>
+      <w:proofErr w:type="spellEnd"/>
+      <w:r>
+        <w:t xml:space="preserve"> </w:t>
+      </w:r>
+      <w:proofErr w:type="spellStart"/>
+      <w:r>
         <w:t>lună</w:t>
       </w:r>
       <w:proofErr w:type="spellEnd"/>
@@ -5965,7 +7025,19 @@
       </w:r>
       <w:proofErr w:type="spellEnd"/>
       <w:r>
-        <w:t xml:space="preserve"> 2024, </w:t>
+        <w:t xml:space="preserve"> 2024</w:t>
+      </w:r>
+      <w:r>
+        <w:t xml:space="preserve"> </w:t>
+      </w:r>
+      <w:r>
+        <w:rPr>
+          <w:lang w:val="ro-RO"/>
+        </w:rPr>
+        <w:t>și</w:t>
+      </w:r>
+      <w:r>
+        <w:t xml:space="preserve"> </w:t>
       </w:r>
       <w:proofErr w:type="spellStart"/>
       <w:r>
@@ -5997,7 +7069,10 @@
       </w:r>
       <w:proofErr w:type="gramEnd"/>
       <w:r>
-        <w:t xml:space="preserve">3) </w:t>
+        <w:t>3)</w:t>
+      </w:r>
+      <w:r>
+        <w:t xml:space="preserve"> </w:t>
       </w:r>
       <w:proofErr w:type="spellStart"/>
       <w:r>
@@ -6005,7 +7080,7 @@
       </w:r>
       <w:proofErr w:type="spellEnd"/>
       <w:r>
-        <w:t xml:space="preserve"> „</w:t>
+        <w:t xml:space="preserve"> “</w:t>
       </w:r>
       <w:proofErr w:type="gramStart"/>
       <w:r>
@@ -6017,54 +7092,6 @@
       </w:r>
       <w:proofErr w:type="spellStart"/>
       <w:r>
-        <w:t>și</w:t>
-      </w:r>
-      <w:proofErr w:type="spellEnd"/>
-      <w:r>
-        <w:t xml:space="preserve"> </w:t>
-      </w:r>
-      <w:proofErr w:type="spellStart"/>
-      <w:r>
-        <w:t>pentru</w:t>
-      </w:r>
-      <w:proofErr w:type="spellEnd"/>
-      <w:r>
-        <w:t xml:space="preserve"> </w:t>
-      </w:r>
-      <w:proofErr w:type="spellStart"/>
-      <w:r>
-        <w:t>fiecare</w:t>
-      </w:r>
-      <w:proofErr w:type="spellEnd"/>
-      <w:r>
-        <w:t xml:space="preserve"> </w:t>
-      </w:r>
-      <w:proofErr w:type="spellStart"/>
-      <w:r>
-        <w:t>dintre</w:t>
-      </w:r>
-      <w:proofErr w:type="spellEnd"/>
-      <w:r>
-        <w:t xml:space="preserve"> </w:t>
-      </w:r>
-      <w:proofErr w:type="spellStart"/>
-      <w:r>
-        <w:t>camerele</w:t>
-      </w:r>
-      <w:proofErr w:type="spellEnd"/>
-      <w:r>
-        <w:t xml:space="preserve"> cu Id-ul </w:t>
-      </w:r>
-      <w:proofErr w:type="spellStart"/>
-      <w:r>
-        <w:t>între</w:t>
-      </w:r>
-      <w:proofErr w:type="spellEnd"/>
-      <w:r>
-        <w:t xml:space="preserve"> 1-5, </w:t>
-      </w:r>
-      <w:proofErr w:type="spellStart"/>
-      <w:r>
         <w:t>să</w:t>
       </w:r>
       <w:proofErr w:type="spellEnd"/>
@@ -6078,6 +7105,108 @@
       <w:proofErr w:type="spellEnd"/>
       <w:r>
         <w:t>:</w:t>
+      </w:r>
+    </w:p>
+    <w:p>
+      <w:pPr>
+        <w:pStyle w:val="ListParagraph"/>
+        <w:numPr>
+          <w:ilvl w:val="0"/>
+          <w:numId w:val="32"/>
+        </w:numPr>
+        <w:jc w:val="both"/>
+      </w:pPr>
+      <w:proofErr w:type="spellStart"/>
+      <w:r>
+        <w:rPr>
+          <w:b/>
+          <w:bCs/>
+        </w:rPr>
+        <w:t>ponderea</w:t>
+      </w:r>
+      <w:proofErr w:type="spellEnd"/>
+      <w:r>
+        <w:rPr>
+          <w:b/>
+          <w:bCs/>
+        </w:rPr>
+        <w:t xml:space="preserve"> </w:t>
+      </w:r>
+      <w:proofErr w:type="spellStart"/>
+      <w:r>
+        <w:rPr>
+          <w:b/>
+          <w:bCs/>
+        </w:rPr>
+        <w:t>procentuală</w:t>
+      </w:r>
+      <w:proofErr w:type="spellEnd"/>
+      <w:r>
+        <w:t xml:space="preserve"> </w:t>
+      </w:r>
+      <w:proofErr w:type="gramStart"/>
+      <w:r>
+        <w:t>a</w:t>
+      </w:r>
+      <w:proofErr w:type="gramEnd"/>
+      <w:r>
+        <w:t xml:space="preserve"> </w:t>
+      </w:r>
+      <w:proofErr w:type="spellStart"/>
+      <w:r>
+        <w:t>acestui</w:t>
+      </w:r>
+      <w:proofErr w:type="spellEnd"/>
+      <w:r>
+        <w:t xml:space="preserve"> </w:t>
+      </w:r>
+      <w:proofErr w:type="spellStart"/>
+      <w:r>
+        <w:t>venit</w:t>
+      </w:r>
+      <w:proofErr w:type="spellEnd"/>
+      <w:r>
+        <w:t xml:space="preserve"> din </w:t>
+      </w:r>
+      <w:proofErr w:type="spellStart"/>
+      <w:r>
+        <w:t>totalul</w:t>
+      </w:r>
+      <w:proofErr w:type="spellEnd"/>
+      <w:r>
+        <w:t xml:space="preserve"> </w:t>
+      </w:r>
+      <w:proofErr w:type="spellStart"/>
+      <w:r>
+        <w:t>veniturilor</w:t>
+      </w:r>
+      <w:proofErr w:type="spellEnd"/>
+      <w:r>
+        <w:t xml:space="preserve"> </w:t>
+      </w:r>
+      <w:proofErr w:type="spellStart"/>
+      <w:r>
+        <w:t>camerei</w:t>
+      </w:r>
+      <w:proofErr w:type="spellEnd"/>
+      <w:r>
+        <w:t xml:space="preserve">, </w:t>
+      </w:r>
+      <w:proofErr w:type="spellStart"/>
+      <w:r>
+        <w:t>în</w:t>
+      </w:r>
+      <w:proofErr w:type="spellEnd"/>
+      <w:r>
+        <w:t xml:space="preserve"> luna </w:t>
+      </w:r>
+      <w:proofErr w:type="spellStart"/>
+      <w:r>
+        <w:t>respectivă</w:t>
+      </w:r>
+      <w:proofErr w:type="spellEnd"/>
+      <w:r>
+        <w:t>;</w:t>
       </w:r>
     </w:p>
     <w:p>
@@ -6094,18 +7223,27 @@
           <w:b/>
           <w:bCs/>
         </w:rPr>
+        <w:t>diferența</w:t>
+      </w:r>
+      <w:proofErr w:type="spellEnd"/>
+      <w:r>
+        <w:t xml:space="preserve"> </w:t>
+      </w:r>
+      <w:proofErr w:type="spellStart"/>
+      <w:r>
+        <w:t>dintre</w:t>
+      </w:r>
+      <w:proofErr w:type="spellEnd"/>
+      <w:r>
+        <w:t xml:space="preserve"> </w:t>
+      </w:r>
+      <w:proofErr w:type="spellStart"/>
+      <w:r>
         <w:t>venitul</w:t>
       </w:r>
       <w:proofErr w:type="spellEnd"/>
       <w:r>
-        <w:rPr>
-          <w:b/>
-          <w:bCs/>
-        </w:rPr>
-        <w:t xml:space="preserve"> total</w:t>
-      </w:r>
-      <w:r>
-        <w:t xml:space="preserve"> </w:t>
+        <w:t xml:space="preserve"> total </w:t>
       </w:r>
       <w:proofErr w:type="spellStart"/>
       <w:r>
@@ -6113,50 +7251,46 @@
       </w:r>
       <w:proofErr w:type="spellEnd"/>
       <w:r>
-        <w:t xml:space="preserve"> </w:t>
-      </w:r>
-      <w:proofErr w:type="spellStart"/>
-      <w:r>
-        <w:t>pentru</w:t>
-      </w:r>
-      <w:proofErr w:type="spellEnd"/>
-      <w:r>
-        <w:t xml:space="preserve"> </w:t>
-      </w:r>
-      <w:proofErr w:type="spellStart"/>
-      <w:r>
-        <w:t>acea</w:t>
-      </w:r>
-      <w:proofErr w:type="spellEnd"/>
-      <w:r>
-        <w:t xml:space="preserve"> </w:t>
-      </w:r>
-      <w:proofErr w:type="spellStart"/>
-      <w:r>
-        <w:rPr>
-          <w:b/>
-          <w:bCs/>
-        </w:rPr>
-        <w:t>metodă</w:t>
-      </w:r>
-      <w:proofErr w:type="spellEnd"/>
-      <w:r>
-        <w:rPr>
-          <w:b/>
-          <w:bCs/>
-        </w:rPr>
+        <w:t xml:space="preserve"> pe </w:t>
+      </w:r>
+      <w:proofErr w:type="spellStart"/>
+      <w:r>
+        <w:t>metoda</w:t>
+      </w:r>
+      <w:proofErr w:type="spellEnd"/>
+      <w:r>
         <w:t xml:space="preserve"> de </w:t>
       </w:r>
       <w:proofErr w:type="spellStart"/>
       <w:r>
-        <w:rPr>
-          <w:b/>
-          <w:bCs/>
-        </w:rPr>
         <w:t>plată</w:t>
       </w:r>
       <w:proofErr w:type="spellEnd"/>
       <w:r>
+        <w:t xml:space="preserve"> </w:t>
+      </w:r>
+      <w:proofErr w:type="spellStart"/>
+      <w:r>
+        <w:t>și</w:t>
+      </w:r>
+      <w:proofErr w:type="spellEnd"/>
+      <w:r>
+        <w:t xml:space="preserve"> media </w:t>
+      </w:r>
+      <w:proofErr w:type="spellStart"/>
+      <w:r>
+        <w:t>veniturilor</w:t>
+      </w:r>
+      <w:proofErr w:type="spellEnd"/>
+      <w:r>
+        <w:t xml:space="preserve"> pe </w:t>
+      </w:r>
+      <w:proofErr w:type="spellStart"/>
+      <w:r>
+        <w:t>cameră</w:t>
+      </w:r>
+      <w:proofErr w:type="spellEnd"/>
+      <w:r>
         <w:t xml:space="preserve">, </w:t>
       </w:r>
       <w:proofErr w:type="spellStart"/>
@@ -6173,696 +7307,1274 @@
       </w:r>
       <w:proofErr w:type="spellEnd"/>
       <w:r>
-        <w:t>;</w:t>
+        <w:t>.</w:t>
       </w:r>
     </w:p>
     <w:p>
       <w:pPr>
+        <w:ind w:firstLine="360"/>
+        <w:jc w:val="both"/>
+        <w:rPr>
+          <w:b/>
+          <w:bCs/>
+        </w:rPr>
+      </w:pPr>
+      <w:proofErr w:type="spellStart"/>
+      <w:r>
+        <w:rPr>
+          <w:b/>
+          <w:bCs/>
+        </w:rPr>
+        <w:t>Reprezentare</w:t>
+      </w:r>
+      <w:proofErr w:type="spellEnd"/>
+      <w:r>
+        <w:rPr>
+          <w:b/>
+          <w:bCs/>
+        </w:rPr>
+        <w:t xml:space="preserve"> </w:t>
+      </w:r>
+      <w:proofErr w:type="spellStart"/>
+      <w:r>
+        <w:rPr>
+          <w:b/>
+          <w:bCs/>
+        </w:rPr>
+        <w:t>grafică</w:t>
+      </w:r>
+      <w:proofErr w:type="spellEnd"/>
+      <w:r>
+        <w:rPr>
+          <w:b/>
+          <w:bCs/>
+        </w:rPr>
+        <w:t>:</w:t>
+      </w:r>
+    </w:p>
+    <w:p>
+      <w:pPr>
+        <w:ind w:firstLine="360"/>
+        <w:jc w:val="both"/>
+        <w:rPr>
+          <w:b/>
+          <w:bCs/>
+        </w:rPr>
+      </w:pPr>
+      <w:r>
+        <w:rPr>
+          <w:lang w:val="ro"/>
+        </w:rPr>
+        <w:t>Pentru fiecare camera vor exista doua grafice:</w:t>
+      </w:r>
+    </w:p>
+    <w:p>
+      <w:pPr>
+        <w:pStyle w:val="ListParagraph"/>
         <w:numPr>
-          <w:ilvl w:val="0"/>
-          <w:numId w:val="29"/>
+          <w:ilvl w:val="2"/>
+          <w:numId w:val="31"/>
         </w:numPr>
         <w:jc w:val="both"/>
-      </w:pPr>
-      <w:proofErr w:type="spellStart"/>
-      <w:r>
-        <w:rPr>
-          <w:b/>
-          <w:bCs/>
-        </w:rPr>
-        <w:t>ponderea</w:t>
-      </w:r>
-      <w:proofErr w:type="spellEnd"/>
-      <w:r>
-        <w:rPr>
-          <w:b/>
-          <w:bCs/>
-        </w:rPr>
-        <w:t xml:space="preserve"> </w:t>
-      </w:r>
-      <w:proofErr w:type="spellStart"/>
-      <w:r>
-        <w:rPr>
-          <w:b/>
-          <w:bCs/>
-        </w:rPr>
-        <w:t>procentuală</w:t>
-      </w:r>
-      <w:proofErr w:type="spellEnd"/>
-      <w:r>
-        <w:t xml:space="preserve"> </w:t>
-      </w:r>
-      <w:proofErr w:type="gramStart"/>
-      <w:r>
-        <w:t>a</w:t>
-      </w:r>
-      <w:proofErr w:type="gramEnd"/>
-      <w:r>
-        <w:t xml:space="preserve"> </w:t>
-      </w:r>
-      <w:proofErr w:type="spellStart"/>
-      <w:r>
-        <w:t>acestui</w:t>
-      </w:r>
-      <w:proofErr w:type="spellEnd"/>
-      <w:r>
-        <w:t xml:space="preserve"> </w:t>
-      </w:r>
-      <w:proofErr w:type="spellStart"/>
-      <w:r>
-        <w:t>venit</w:t>
-      </w:r>
-      <w:proofErr w:type="spellEnd"/>
-      <w:r>
-        <w:t xml:space="preserve"> din </w:t>
-      </w:r>
-      <w:proofErr w:type="spellStart"/>
-      <w:r>
-        <w:t>totalul</w:t>
-      </w:r>
-      <w:proofErr w:type="spellEnd"/>
-      <w:r>
-        <w:t xml:space="preserve"> </w:t>
-      </w:r>
-      <w:proofErr w:type="spellStart"/>
-      <w:r>
-        <w:t>veniturilor</w:t>
-      </w:r>
-      <w:proofErr w:type="spellEnd"/>
-      <w:r>
-        <w:t xml:space="preserve"> </w:t>
-      </w:r>
-      <w:proofErr w:type="spellStart"/>
-      <w:r>
-        <w:t>camerei</w:t>
-      </w:r>
-      <w:proofErr w:type="spellEnd"/>
-      <w:r>
-        <w:t xml:space="preserve">, </w:t>
-      </w:r>
-      <w:proofErr w:type="spellStart"/>
-      <w:r>
-        <w:t>în</w:t>
-      </w:r>
-      <w:proofErr w:type="spellEnd"/>
-      <w:r>
-        <w:t xml:space="preserve"> luna </w:t>
-      </w:r>
-      <w:proofErr w:type="spellStart"/>
-      <w:r>
-        <w:t>respectivă</w:t>
-      </w:r>
-      <w:proofErr w:type="spellEnd"/>
-      <w:r>
-        <w:t>;</w:t>
+        <w:rPr>
+          <w:b/>
+          <w:bCs/>
+        </w:rPr>
+      </w:pPr>
+      <w:proofErr w:type="spellStart"/>
+      <w:r>
+        <w:rPr>
+          <w:b/>
+          <w:bCs/>
+        </w:rPr>
+        <w:t>Grafic</w:t>
+      </w:r>
+      <w:proofErr w:type="spellEnd"/>
+      <w:r>
+        <w:rPr>
+          <w:b/>
+          <w:bCs/>
+        </w:rPr>
+        <w:t xml:space="preserve">: </w:t>
+      </w:r>
+      <w:proofErr w:type="spellStart"/>
+      <w:r>
+        <w:rPr>
+          <w:b/>
+          <w:bCs/>
+        </w:rPr>
+        <w:t>Distribuția</w:t>
+      </w:r>
+      <w:proofErr w:type="spellEnd"/>
+      <w:r>
+        <w:rPr>
+          <w:b/>
+          <w:bCs/>
+        </w:rPr>
+        <w:t xml:space="preserve"> </w:t>
+      </w:r>
+      <w:proofErr w:type="spellStart"/>
+      <w:r>
+        <w:rPr>
+          <w:b/>
+          <w:bCs/>
+        </w:rPr>
+        <w:t>Procentuală</w:t>
+      </w:r>
+      <w:proofErr w:type="spellEnd"/>
+      <w:r>
+        <w:rPr>
+          <w:b/>
+          <w:bCs/>
+        </w:rPr>
+        <w:t xml:space="preserve"> (Stacked 100% Bar Chart)</w:t>
       </w:r>
     </w:p>
     <w:p>
       <w:pPr>
+        <w:pStyle w:val="ListParagraph"/>
+        <w:ind w:left="927"/>
+        <w:jc w:val="both"/>
+      </w:pPr>
+      <w:r>
+        <w:rPr>
+          <w:b/>
+          <w:bCs/>
+        </w:rPr>
+        <w:lastRenderedPageBreak/>
+        <w:t xml:space="preserve">Scop: </w:t>
+      </w:r>
+      <w:proofErr w:type="spellStart"/>
+      <w:r>
+        <w:t>Să</w:t>
+      </w:r>
+      <w:proofErr w:type="spellEnd"/>
+      <w:r>
+        <w:t xml:space="preserve"> </w:t>
+      </w:r>
+      <w:proofErr w:type="spellStart"/>
+      <w:r>
+        <w:t>arate</w:t>
+      </w:r>
+      <w:proofErr w:type="spellEnd"/>
+      <w:r>
+        <w:t xml:space="preserve"> </w:t>
+      </w:r>
+      <w:proofErr w:type="spellStart"/>
+      <w:r>
+        <w:t>proporția</w:t>
+      </w:r>
+      <w:proofErr w:type="spellEnd"/>
+      <w:r>
+        <w:t xml:space="preserve"> </w:t>
+      </w:r>
+      <w:proofErr w:type="spellStart"/>
+      <w:r>
+        <w:t>dintre</w:t>
+      </w:r>
+      <w:proofErr w:type="spellEnd"/>
+      <w:r>
+        <w:t xml:space="preserve"> </w:t>
+      </w:r>
+      <w:proofErr w:type="spellStart"/>
+      <w:r>
+        <w:t>metodele</w:t>
+      </w:r>
+      <w:proofErr w:type="spellEnd"/>
+      <w:r>
+        <w:t xml:space="preserve"> de </w:t>
+      </w:r>
+      <w:proofErr w:type="spellStart"/>
+      <w:r>
+        <w:t>plată</w:t>
+      </w:r>
+      <w:proofErr w:type="spellEnd"/>
+      <w:r>
+        <w:t xml:space="preserve"> (Cash vs. Transfer) </w:t>
+      </w:r>
+      <w:proofErr w:type="spellStart"/>
+      <w:r>
+        <w:t>în</w:t>
+      </w:r>
+      <w:proofErr w:type="spellEnd"/>
+      <w:r>
+        <w:t xml:space="preserve"> </w:t>
+      </w:r>
+      <w:proofErr w:type="spellStart"/>
+      <w:r>
+        <w:t>fiecare</w:t>
+      </w:r>
+      <w:proofErr w:type="spellEnd"/>
+      <w:r>
+        <w:t xml:space="preserve"> </w:t>
+      </w:r>
+      <w:proofErr w:type="spellStart"/>
+      <w:r>
+        <w:t>lună</w:t>
+      </w:r>
+      <w:proofErr w:type="spellEnd"/>
+      <w:r>
+        <w:t>.</w:t>
+      </w:r>
+    </w:p>
+    <w:p>
+      <w:pPr>
+        <w:pStyle w:val="ListParagraph"/>
+        <w:ind w:left="927"/>
+        <w:jc w:val="both"/>
+      </w:pPr>
+      <w:r>
+        <w:rPr>
+          <w:b/>
+          <w:bCs/>
+          <w:lang w:val="ro"/>
+        </w:rPr>
+        <w:t>Axa X (Orizontală):</w:t>
+      </w:r>
+      <w:r>
+        <w:rPr>
+          <w:lang w:val="ro"/>
+        </w:rPr>
+        <w:t xml:space="preserve"> Lunile anului (Ian - Dec).</w:t>
+      </w:r>
+    </w:p>
+    <w:p>
+      <w:pPr>
+        <w:pStyle w:val="ListParagraph"/>
+        <w:ind w:left="927"/>
+        <w:jc w:val="both"/>
+      </w:pPr>
+      <w:r>
+        <w:rPr>
+          <w:b/>
+          <w:bCs/>
+          <w:lang w:val="ro"/>
+        </w:rPr>
+        <w:t>Axa Y (Verticală):</w:t>
+      </w:r>
+      <w:r>
+        <w:rPr>
+          <w:lang w:val="ro"/>
+        </w:rPr>
+        <w:t xml:space="preserve"> Scara procentuală fixă (0% - 100%).</w:t>
+      </w:r>
+    </w:p>
+    <w:p>
+      <w:pPr>
+        <w:pStyle w:val="ListParagraph"/>
+        <w:ind w:left="927"/>
+        <w:jc w:val="both"/>
+      </w:pPr>
+      <w:r>
+        <w:rPr>
+          <w:b/>
+          <w:bCs/>
+          <w:lang w:val="ro"/>
+        </w:rPr>
+        <w:t>Reprezentare:</w:t>
+      </w:r>
+      <w:r>
+        <w:rPr>
+          <w:lang w:val="ro"/>
+        </w:rPr>
+        <w:t xml:space="preserve"> Fiecare lună are o singură bară verticală împărțită în două culori stivuite. Suma celor două segmente este mereu 100%.</w:t>
+      </w:r>
+    </w:p>
+    <w:p>
+      <w:pPr>
+        <w:pStyle w:val="ListParagraph"/>
+        <w:ind w:left="927"/>
+        <w:jc w:val="both"/>
+      </w:pPr>
+    </w:p>
+    <w:p>
+      <w:pPr>
+        <w:pStyle w:val="ListParagraph"/>
         <w:numPr>
-          <w:ilvl w:val="0"/>
-          <w:numId w:val="29"/>
+          <w:ilvl w:val="1"/>
+          <w:numId w:val="31"/>
         </w:numPr>
         <w:jc w:val="both"/>
-      </w:pPr>
-      <w:proofErr w:type="spellStart"/>
-      <w:r>
-        <w:rPr>
-          <w:b/>
-          <w:bCs/>
-        </w:rPr>
-        <w:t>diferența</w:t>
-      </w:r>
-      <w:proofErr w:type="spellEnd"/>
-      <w:r>
-        <w:t xml:space="preserve"> </w:t>
-      </w:r>
-      <w:proofErr w:type="spellStart"/>
-      <w:r>
-        <w:t>dintre</w:t>
-      </w:r>
-      <w:proofErr w:type="spellEnd"/>
-      <w:r>
-        <w:t xml:space="preserve"> </w:t>
-      </w:r>
-      <w:proofErr w:type="spellStart"/>
-      <w:r>
-        <w:t>venitul</w:t>
-      </w:r>
-      <w:proofErr w:type="spellEnd"/>
-      <w:r>
-        <w:t xml:space="preserve"> total </w:t>
-      </w:r>
-      <w:proofErr w:type="spellStart"/>
-      <w:r>
-        <w:t>realizat</w:t>
-      </w:r>
-      <w:proofErr w:type="spellEnd"/>
-      <w:r>
-        <w:t xml:space="preserve"> pe </w:t>
-      </w:r>
-      <w:proofErr w:type="spellStart"/>
-      <w:r>
-        <w:t>metoda</w:t>
-      </w:r>
-      <w:proofErr w:type="spellEnd"/>
-      <w:r>
-        <w:t xml:space="preserve"> de </w:t>
-      </w:r>
-      <w:proofErr w:type="spellStart"/>
-      <w:r>
-        <w:t>plată</w:t>
-      </w:r>
-      <w:proofErr w:type="spellEnd"/>
-      <w:r>
-        <w:t xml:space="preserve"> </w:t>
-      </w:r>
-      <w:proofErr w:type="spellStart"/>
-      <w:r>
-        <w:t>și</w:t>
-      </w:r>
-      <w:proofErr w:type="spellEnd"/>
-      <w:r>
-        <w:t xml:space="preserve"> media </w:t>
-      </w:r>
-      <w:proofErr w:type="spellStart"/>
-      <w:r>
-        <w:t>veniturilor</w:t>
-      </w:r>
-      <w:proofErr w:type="spellEnd"/>
-      <w:r>
-        <w:t xml:space="preserve"> pe </w:t>
-      </w:r>
-      <w:proofErr w:type="spellStart"/>
-      <w:r>
-        <w:t>cameră</w:t>
-      </w:r>
-      <w:proofErr w:type="spellEnd"/>
-      <w:r>
-        <w:t xml:space="preserve">, </w:t>
-      </w:r>
-      <w:proofErr w:type="spellStart"/>
-      <w:r>
-        <w:t>în</w:t>
-      </w:r>
-      <w:proofErr w:type="spellEnd"/>
-      <w:r>
-        <w:t xml:space="preserve"> luna </w:t>
-      </w:r>
-      <w:proofErr w:type="spellStart"/>
-      <w:r>
-        <w:t>respectivă</w:t>
-      </w:r>
-      <w:proofErr w:type="spellEnd"/>
-      <w:r>
-        <w:t>.</w:t>
+        <w:rPr>
+          <w:b/>
+          <w:bCs/>
+        </w:rPr>
+      </w:pPr>
+      <w:proofErr w:type="spellStart"/>
+      <w:r>
+        <w:rPr>
+          <w:b/>
+          <w:bCs/>
+        </w:rPr>
+        <w:t>Grafic</w:t>
+      </w:r>
+      <w:proofErr w:type="spellEnd"/>
+      <w:r>
+        <w:rPr>
+          <w:b/>
+          <w:bCs/>
+        </w:rPr>
+        <w:t xml:space="preserve">: </w:t>
+      </w:r>
+      <w:proofErr w:type="spellStart"/>
+      <w:r>
+        <w:rPr>
+          <w:b/>
+          <w:bCs/>
+        </w:rPr>
+        <w:t>Abaterea</w:t>
+      </w:r>
+      <w:proofErr w:type="spellEnd"/>
+      <w:r>
+        <w:rPr>
+          <w:b/>
+          <w:bCs/>
+        </w:rPr>
+        <w:t xml:space="preserve"> de la Medie (Diverging Bar Chart)</w:t>
       </w:r>
     </w:p>
     <w:p>
       <w:pPr>
-        <w:ind w:left="360"/>
+        <w:pStyle w:val="ListParagraph"/>
+        <w:ind w:left="927"/>
         <w:jc w:val="both"/>
-        <w:rPr>
-          <w:lang w:val="ro-RO"/>
-        </w:rPr>
-      </w:pPr>
+      </w:pPr>
+      <w:r>
+        <w:rPr>
+          <w:b/>
+          <w:bCs/>
+        </w:rPr>
+        <w:t>Scop:</w:t>
+      </w:r>
+      <w:r>
+        <w:t xml:space="preserve"> </w:t>
+      </w:r>
+      <w:proofErr w:type="spellStart"/>
+      <w:r>
+        <w:t>Să</w:t>
+      </w:r>
+      <w:proofErr w:type="spellEnd"/>
+      <w:r>
+        <w:t xml:space="preserve"> </w:t>
+      </w:r>
+      <w:proofErr w:type="spellStart"/>
+      <w:r>
+        <w:t>arate</w:t>
+      </w:r>
+      <w:proofErr w:type="spellEnd"/>
+      <w:r>
+        <w:t xml:space="preserve"> </w:t>
+      </w:r>
+      <w:proofErr w:type="spellStart"/>
+      <w:r>
+        <w:t>dacă</w:t>
+      </w:r>
+      <w:proofErr w:type="spellEnd"/>
+      <w:r>
+        <w:t xml:space="preserve"> o </w:t>
+      </w:r>
+      <w:proofErr w:type="spellStart"/>
+      <w:r>
+        <w:t>metodă</w:t>
+      </w:r>
+      <w:proofErr w:type="spellEnd"/>
+      <w:r>
+        <w:t xml:space="preserve"> de </w:t>
+      </w:r>
+      <w:proofErr w:type="spellStart"/>
+      <w:r>
+        <w:t>plată</w:t>
+      </w:r>
+      <w:proofErr w:type="spellEnd"/>
+      <w:r>
+        <w:t xml:space="preserve"> a </w:t>
+      </w:r>
+      <w:proofErr w:type="spellStart"/>
+      <w:r>
+        <w:t>performat</w:t>
+      </w:r>
+      <w:proofErr w:type="spellEnd"/>
+      <w:r>
+        <w:t xml:space="preserve"> </w:t>
+      </w:r>
+      <w:proofErr w:type="spellStart"/>
+      <w:r>
+        <w:t>peste</w:t>
+      </w:r>
+      <w:proofErr w:type="spellEnd"/>
+      <w:r>
+        <w:t xml:space="preserve"> </w:t>
+      </w:r>
+      <w:proofErr w:type="spellStart"/>
+      <w:r>
+        <w:t>sau</w:t>
+      </w:r>
+      <w:proofErr w:type="spellEnd"/>
+      <w:r>
+        <w:t xml:space="preserve"> sub media </w:t>
+      </w:r>
+      <w:proofErr w:type="spellStart"/>
+      <w:r>
+        <w:t>obișnuită</w:t>
+      </w:r>
+      <w:proofErr w:type="spellEnd"/>
+      <w:r>
+        <w:t xml:space="preserve"> a </w:t>
+      </w:r>
+      <w:proofErr w:type="spellStart"/>
+      <w:r>
+        <w:t>camerei</w:t>
+      </w:r>
+      <w:proofErr w:type="spellEnd"/>
+      <w:r>
+        <w:t xml:space="preserve"> </w:t>
+      </w:r>
+      <w:proofErr w:type="spellStart"/>
+      <w:r>
+        <w:t>în</w:t>
+      </w:r>
+      <w:proofErr w:type="spellEnd"/>
+      <w:r>
+        <w:t xml:space="preserve"> luna </w:t>
+      </w:r>
+      <w:proofErr w:type="spellStart"/>
+      <w:r>
+        <w:t>respectivă</w:t>
+      </w:r>
+      <w:proofErr w:type="spellEnd"/>
+      <w:r>
+        <w:t>.</w:t>
+      </w:r>
     </w:p>
     <w:p>
       <w:pPr>
+        <w:pStyle w:val="ListParagraph"/>
+        <w:ind w:left="927"/>
+        <w:jc w:val="both"/>
+      </w:pPr>
+      <w:r>
+        <w:rPr>
+          <w:b/>
+          <w:bCs/>
+        </w:rPr>
+        <w:t>Axa X (</w:t>
+      </w:r>
+      <w:proofErr w:type="spellStart"/>
+      <w:r>
+        <w:rPr>
+          <w:b/>
+          <w:bCs/>
+        </w:rPr>
+        <w:t>Orizontală</w:t>
+      </w:r>
+      <w:proofErr w:type="spellEnd"/>
+      <w:r>
+        <w:rPr>
+          <w:b/>
+          <w:bCs/>
+        </w:rPr>
+        <w:t>):</w:t>
+      </w:r>
+      <w:r>
+        <w:t xml:space="preserve"> Lunile </w:t>
+      </w:r>
+      <w:proofErr w:type="spellStart"/>
+      <w:r>
+        <w:t>anului</w:t>
+      </w:r>
+      <w:proofErr w:type="spellEnd"/>
+      <w:r>
+        <w:t xml:space="preserve"> (Ian - Dec).</w:t>
+      </w:r>
+    </w:p>
+    <w:p>
+      <w:pPr>
+        <w:pStyle w:val="ListParagraph"/>
+        <w:ind w:left="927"/>
+        <w:jc w:val="both"/>
+      </w:pPr>
+      <w:r>
+        <w:rPr>
+          <w:b/>
+          <w:bCs/>
+        </w:rPr>
+        <w:t>Axa Y (</w:t>
+      </w:r>
+      <w:proofErr w:type="spellStart"/>
+      <w:r>
+        <w:rPr>
+          <w:b/>
+          <w:bCs/>
+        </w:rPr>
+        <w:t>Verticală</w:t>
+      </w:r>
+      <w:proofErr w:type="spellEnd"/>
+      <w:r>
+        <w:rPr>
+          <w:b/>
+          <w:bCs/>
+        </w:rPr>
+        <w:t xml:space="preserve">): </w:t>
+      </w:r>
+      <w:r>
+        <w:t xml:space="preserve">Valori </w:t>
+      </w:r>
+      <w:proofErr w:type="spellStart"/>
+      <w:r>
+        <w:t>numerice</w:t>
+      </w:r>
+      <w:proofErr w:type="spellEnd"/>
+      <w:r>
+        <w:t xml:space="preserve">. Linia de </w:t>
+      </w:r>
+      <w:proofErr w:type="spellStart"/>
+      <w:r>
+        <w:t>referință</w:t>
+      </w:r>
+      <w:proofErr w:type="spellEnd"/>
+      <w:r>
+        <w:t xml:space="preserve"> 0 </w:t>
+      </w:r>
+      <w:proofErr w:type="spellStart"/>
+      <w:r>
+        <w:t>este</w:t>
+      </w:r>
+      <w:proofErr w:type="spellEnd"/>
+      <w:r>
+        <w:t xml:space="preserve"> la </w:t>
+      </w:r>
+      <w:proofErr w:type="spellStart"/>
+      <w:r>
+        <w:t>mijlocul</w:t>
+      </w:r>
+      <w:proofErr w:type="spellEnd"/>
+      <w:r>
+        <w:t xml:space="preserve"> </w:t>
+      </w:r>
+      <w:proofErr w:type="spellStart"/>
+      <w:r>
+        <w:t>axei</w:t>
+      </w:r>
+      <w:proofErr w:type="spellEnd"/>
+      <w:r>
+        <w:t>.</w:t>
+      </w:r>
+    </w:p>
+    <w:p>
+      <w:pPr>
+        <w:pStyle w:val="ListParagraph"/>
+        <w:ind w:left="927"/>
+        <w:jc w:val="both"/>
+        <w:rPr>
+          <w:b/>
+          <w:bCs/>
+        </w:rPr>
+      </w:pPr>
+      <w:proofErr w:type="spellStart"/>
+      <w:r>
+        <w:rPr>
+          <w:b/>
+          <w:bCs/>
+        </w:rPr>
+        <w:t>Reprezentare</w:t>
+      </w:r>
+      <w:proofErr w:type="spellEnd"/>
+      <w:r>
+        <w:rPr>
+          <w:b/>
+          <w:bCs/>
+        </w:rPr>
+        <w:t>:</w:t>
+      </w:r>
+    </w:p>
+    <w:p>
+      <w:pPr>
+        <w:pStyle w:val="ListParagraph"/>
+        <w:ind w:left="927" w:firstLine="513"/>
+        <w:jc w:val="both"/>
+      </w:pPr>
+      <w:r>
+        <w:t xml:space="preserve">Bare orientate </w:t>
+      </w:r>
+      <w:proofErr w:type="spellStart"/>
+      <w:r>
+        <w:t>în</w:t>
+      </w:r>
+      <w:proofErr w:type="spellEnd"/>
+      <w:r>
+        <w:t xml:space="preserve"> SUS (</w:t>
+      </w:r>
+      <w:proofErr w:type="spellStart"/>
+      <w:r>
+        <w:t>pozitive</w:t>
+      </w:r>
+      <w:proofErr w:type="spellEnd"/>
+      <w:r>
+        <w:t xml:space="preserve">) = Venit </w:t>
+      </w:r>
+      <w:proofErr w:type="spellStart"/>
+      <w:r>
+        <w:t>peste</w:t>
+      </w:r>
+      <w:proofErr w:type="spellEnd"/>
+      <w:r>
+        <w:t xml:space="preserve"> </w:t>
+      </w:r>
+      <w:proofErr w:type="spellStart"/>
+      <w:r>
+        <w:t>medie</w:t>
+      </w:r>
+      <w:proofErr w:type="spellEnd"/>
+      <w:r>
+        <w:t>.</w:t>
+      </w:r>
+    </w:p>
+    <w:p>
+      <w:pPr>
+        <w:pStyle w:val="ListParagraph"/>
+        <w:ind w:left="927" w:firstLine="513"/>
+        <w:jc w:val="both"/>
+      </w:pPr>
+      <w:r>
+        <w:t xml:space="preserve">Bare orientate </w:t>
+      </w:r>
+      <w:proofErr w:type="spellStart"/>
+      <w:r>
+        <w:t>în</w:t>
+      </w:r>
+      <w:proofErr w:type="spellEnd"/>
+      <w:r>
+        <w:t xml:space="preserve"> JOS (negative) = Venit sub </w:t>
+      </w:r>
+      <w:proofErr w:type="spellStart"/>
+      <w:r>
+        <w:t>medie</w:t>
+      </w:r>
+      <w:proofErr w:type="spellEnd"/>
+      <w:r>
+        <w:t>.</w:t>
+      </w:r>
+    </w:p>
+    <w:p>
+      <w:pPr>
+        <w:pStyle w:val="ListParagraph"/>
+        <w:ind w:left="1440"/>
+        <w:jc w:val="both"/>
+        <w:rPr>
+          <w:b/>
+          <w:bCs/>
+        </w:rPr>
+      </w:pPr>
+    </w:p>
+    <w:p>
+      <w:pPr>
+        <w:jc w:val="both"/>
+      </w:pPr>
+      <w:r>
+        <w:rPr>
+          <w:b/>
+          <w:bCs/>
+        </w:rPr>
+        <w:t>Cerere 3:</w:t>
+      </w:r>
+    </w:p>
+    <w:p>
+      <w:pPr>
         <w:ind w:left="720"/>
         <w:jc w:val="both"/>
-        <w:rPr>
-          <w:lang w:val="ro-RO"/>
-        </w:rPr>
-      </w:pPr>
-      <w:r>
-        <w:rPr>
-          <w:lang w:val="ro-RO"/>
-        </w:rPr>
-        <w:t>Tehnici de optimizare:</w:t>
+      </w:pPr>
+      <w:r>
+        <w:t xml:space="preserve">Se </w:t>
+      </w:r>
+      <w:proofErr w:type="spellStart"/>
+      <w:r>
+        <w:t>consideră</w:t>
+      </w:r>
+      <w:proofErr w:type="spellEnd"/>
+      <w:r>
+        <w:t xml:space="preserve"> </w:t>
+      </w:r>
+      <w:proofErr w:type="spellStart"/>
+      <w:r>
+        <w:t>clienți</w:t>
+      </w:r>
+      <w:proofErr w:type="spellEnd"/>
+      <w:r>
+        <w:t xml:space="preserve"> VIP </w:t>
+      </w:r>
+      <w:proofErr w:type="spellStart"/>
+      <w:r>
+        <w:t>acei</w:t>
+      </w:r>
+      <w:proofErr w:type="spellEnd"/>
+      <w:r>
+        <w:t xml:space="preserve"> </w:t>
+      </w:r>
+      <w:proofErr w:type="spellStart"/>
+      <w:r>
+        <w:t>clienți</w:t>
+      </w:r>
+      <w:proofErr w:type="spellEnd"/>
+      <w:r>
+        <w:t xml:space="preserve"> care se </w:t>
+      </w:r>
+      <w:proofErr w:type="spellStart"/>
+      <w:r>
+        <w:t>situează</w:t>
+      </w:r>
+      <w:proofErr w:type="spellEnd"/>
+      <w:r>
+        <w:t xml:space="preserve"> </w:t>
+      </w:r>
+      <w:proofErr w:type="spellStart"/>
+      <w:r>
+        <w:t>în</w:t>
+      </w:r>
+      <w:proofErr w:type="spellEnd"/>
+      <w:r>
+        <w:t xml:space="preserve"> </w:t>
+      </w:r>
+      <w:proofErr w:type="spellStart"/>
+      <w:r>
+        <w:t>topul</w:t>
+      </w:r>
+      <w:proofErr w:type="spellEnd"/>
+      <w:r>
+        <w:t xml:space="preserve"> 5% al </w:t>
+      </w:r>
+      <w:proofErr w:type="spellStart"/>
+      <w:r>
+        <w:t>veniturilor</w:t>
+      </w:r>
+      <w:proofErr w:type="spellEnd"/>
+      <w:r>
+        <w:t xml:space="preserve"> generate </w:t>
+      </w:r>
+      <w:proofErr w:type="spellStart"/>
+      <w:r>
+        <w:t>hotelului</w:t>
+      </w:r>
+      <w:proofErr w:type="spellEnd"/>
+      <w:r>
+        <w:t xml:space="preserve">. </w:t>
+      </w:r>
+      <w:proofErr w:type="spellStart"/>
+      <w:r>
+        <w:t>Pentru</w:t>
+      </w:r>
+      <w:proofErr w:type="spellEnd"/>
+      <w:r>
+        <w:t xml:space="preserve"> </w:t>
+      </w:r>
+      <w:proofErr w:type="spellStart"/>
+      <w:r>
+        <w:t>acești</w:t>
+      </w:r>
+      <w:proofErr w:type="spellEnd"/>
+      <w:r>
+        <w:t xml:space="preserve"> </w:t>
+      </w:r>
+      <w:proofErr w:type="spellStart"/>
+      <w:r>
+        <w:t>clienți</w:t>
+      </w:r>
+      <w:proofErr w:type="spellEnd"/>
+      <w:r>
+        <w:t xml:space="preserve">, </w:t>
+      </w:r>
+      <w:proofErr w:type="spellStart"/>
+      <w:r>
+        <w:t>să</w:t>
+      </w:r>
+      <w:proofErr w:type="spellEnd"/>
+      <w:r>
+        <w:t xml:space="preserve"> se determine </w:t>
+      </w:r>
+      <w:proofErr w:type="spellStart"/>
+      <w:r>
+        <w:t>distribuția</w:t>
+      </w:r>
+      <w:proofErr w:type="spellEnd"/>
+      <w:r>
+        <w:t xml:space="preserve"> </w:t>
+      </w:r>
+      <w:proofErr w:type="spellStart"/>
+      <w:r>
+        <w:t>procentuală</w:t>
+      </w:r>
+      <w:proofErr w:type="spellEnd"/>
+      <w:r>
+        <w:t xml:space="preserve"> a </w:t>
+      </w:r>
+      <w:proofErr w:type="spellStart"/>
+      <w:r>
+        <w:t>rezervărilor</w:t>
+      </w:r>
+      <w:proofErr w:type="spellEnd"/>
+      <w:r>
+        <w:t xml:space="preserve"> pe </w:t>
+      </w:r>
+      <w:proofErr w:type="spellStart"/>
+      <w:r>
+        <w:t>fiecare</w:t>
+      </w:r>
+      <w:proofErr w:type="spellEnd"/>
+      <w:r>
+        <w:t xml:space="preserve"> tip de </w:t>
+      </w:r>
+      <w:proofErr w:type="spellStart"/>
+      <w:r>
+        <w:t>cameră</w:t>
+      </w:r>
+      <w:proofErr w:type="spellEnd"/>
+      <w:r>
+        <w:t xml:space="preserve">, </w:t>
+      </w:r>
+      <w:proofErr w:type="spellStart"/>
+      <w:r>
+        <w:t>raportată</w:t>
+      </w:r>
+      <w:proofErr w:type="spellEnd"/>
+      <w:r>
+        <w:t xml:space="preserve"> la </w:t>
+      </w:r>
+      <w:proofErr w:type="spellStart"/>
+      <w:r>
+        <w:t>numărul</w:t>
+      </w:r>
+      <w:proofErr w:type="spellEnd"/>
+      <w:r>
+        <w:t xml:space="preserve"> total de </w:t>
+      </w:r>
+      <w:proofErr w:type="spellStart"/>
+      <w:r>
+        <w:t>rezervări</w:t>
+      </w:r>
+      <w:proofErr w:type="spellEnd"/>
+      <w:r>
+        <w:t xml:space="preserve"> ale </w:t>
+      </w:r>
+      <w:proofErr w:type="spellStart"/>
+      <w:r>
+        <w:t>acestor</w:t>
+      </w:r>
+      <w:proofErr w:type="spellEnd"/>
+      <w:r>
+        <w:t xml:space="preserve"> </w:t>
+      </w:r>
+      <w:proofErr w:type="spellStart"/>
+      <w:r>
+        <w:t>clienți</w:t>
+      </w:r>
+      <w:proofErr w:type="spellEnd"/>
+      <w:r>
+        <w:t>.</w:t>
       </w:r>
     </w:p>
     <w:p>
       <w:pPr>
-        <w:numPr>
-          <w:ilvl w:val="0"/>
-          <w:numId w:val="30"/>
-        </w:numPr>
-        <w:contextualSpacing/>
+        <w:ind w:firstLine="360"/>
         <w:jc w:val="both"/>
-      </w:pPr>
-      <w:r>
-        <w:rPr>
-          <w:lang w:val="ro-RO"/>
-        </w:rPr>
-        <w:t xml:space="preserve">Indecși </w:t>
-      </w:r>
-      <w:proofErr w:type="spellStart"/>
-      <w:r>
-        <w:rPr>
-          <w:lang w:val="ro-RO"/>
-        </w:rPr>
-        <w:t>Bitmap</w:t>
-      </w:r>
-      <w:proofErr w:type="spellEnd"/>
-      <w:r>
-        <w:rPr>
-          <w:lang w:val="ro-RO"/>
-        </w:rPr>
-        <w:t xml:space="preserve"> pe cheile externe din tabela de fapte</w:t>
-      </w:r>
-      <w:r>
+        <w:rPr>
+          <w:b/>
+          <w:bCs/>
+        </w:rPr>
+      </w:pPr>
+      <w:proofErr w:type="spellStart"/>
+      <w:r>
+        <w:rPr>
+          <w:b/>
+          <w:bCs/>
+        </w:rPr>
+        <w:t>Reprezentare</w:t>
+      </w:r>
+      <w:proofErr w:type="spellEnd"/>
+      <w:r>
+        <w:rPr>
+          <w:b/>
+          <w:bCs/>
+        </w:rPr>
+        <w:t xml:space="preserve"> </w:t>
+      </w:r>
+      <w:proofErr w:type="spellStart"/>
+      <w:r>
+        <w:rPr>
+          <w:b/>
+          <w:bCs/>
+        </w:rPr>
+        <w:t>grafică</w:t>
+      </w:r>
+      <w:proofErr w:type="spellEnd"/>
+      <w:r>
+        <w:rPr>
+          <w:b/>
+          <w:bCs/>
+        </w:rPr>
         <w:t>:</w:t>
       </w:r>
     </w:p>
     <w:p>
       <w:pPr>
-        <w:ind w:left="1080"/>
         <w:jc w:val="both"/>
-      </w:pPr>
-      <w:proofErr w:type="spellStart"/>
-      <w:r>
-        <w:t>fact_rezervari</w:t>
-      </w:r>
-      <w:proofErr w:type="spellEnd"/>
-      <w:r>
-        <w:t xml:space="preserve"> (</w:t>
-      </w:r>
-      <w:proofErr w:type="spellStart"/>
-      <w:r>
-        <w:rPr>
-          <w:b/>
-          <w:bCs/>
-        </w:rPr>
-        <w:t>id_camera_dim</w:t>
-      </w:r>
-      <w:proofErr w:type="spellEnd"/>
-      <w:r>
-        <w:t>)</w:t>
-      </w:r>
-    </w:p>
-    <w:tbl>
-      <w:tblPr>
-        <w:tblStyle w:val="TableGrid1"/>
-        <w:tblW w:w="0" w:type="auto"/>
-        <w:tblInd w:w="1080" w:type="dxa"/>
-        <w:tblLook w:val="04A0" w:firstRow="1" w:lastRow="0" w:firstColumn="1" w:lastColumn="0" w:noHBand="0" w:noVBand="1"/>
-      </w:tblPr>
-      <w:tblGrid>
-        <w:gridCol w:w="4894"/>
-        <w:gridCol w:w="5042"/>
-      </w:tblGrid>
-      <w:tr>
-        <w:tc>
-          <w:tcPr>
-            <w:tcW w:w="5508" w:type="dxa"/>
-            <w:shd w:val="clear" w:color="auto" w:fill="B8CCE4"/>
-          </w:tcPr>
-          <w:p>
-            <w:pPr>
-              <w:jc w:val="both"/>
-              <w:rPr>
-                <w:lang w:val="ro-RO"/>
-              </w:rPr>
-            </w:pPr>
-            <w:r>
-              <w:rPr>
-                <w:lang w:val="ro-RO"/>
-              </w:rPr>
-              <w:t>Avantaj</w:t>
-            </w:r>
-          </w:p>
-        </w:tc>
-        <w:tc>
-          <w:tcPr>
-            <w:tcW w:w="5508" w:type="dxa"/>
-            <w:shd w:val="clear" w:color="auto" w:fill="B8CCE4"/>
-          </w:tcPr>
-          <w:p>
-            <w:pPr>
-              <w:jc w:val="both"/>
-              <w:rPr>
-                <w:lang w:val="ro-RO"/>
-              </w:rPr>
-            </w:pPr>
-            <w:r>
-              <w:rPr>
-                <w:lang w:val="ro-RO"/>
-              </w:rPr>
-              <w:t>Dezavantaj</w:t>
-            </w:r>
-          </w:p>
-        </w:tc>
-      </w:tr>
-      <w:tr>
-        <w:tc>
-          <w:tcPr>
-            <w:tcW w:w="5508" w:type="dxa"/>
-          </w:tcPr>
-          <w:p>
-            <w:pPr>
-              <w:jc w:val="both"/>
-            </w:pPr>
-          </w:p>
-          <w:p>
-            <w:pPr>
-              <w:jc w:val="both"/>
-            </w:pPr>
-            <w:proofErr w:type="spellStart"/>
-            <w:r>
-              <w:t>Filtrarea</w:t>
-            </w:r>
-            <w:proofErr w:type="spellEnd"/>
-            <w:r>
-              <w:t xml:space="preserve"> se face mult </w:t>
-            </w:r>
-            <w:proofErr w:type="spellStart"/>
-            <w:r>
-              <w:t>mai</w:t>
-            </w:r>
-            <w:proofErr w:type="spellEnd"/>
-            <w:r>
-              <w:t xml:space="preserve"> rapid, </w:t>
-            </w:r>
-            <w:proofErr w:type="spellStart"/>
-            <w:r>
-              <w:t>datorită</w:t>
-            </w:r>
-            <w:proofErr w:type="spellEnd"/>
-            <w:r>
-              <w:t xml:space="preserve"> </w:t>
-            </w:r>
-            <w:proofErr w:type="spellStart"/>
-            <w:r>
-              <w:t>faptului</w:t>
-            </w:r>
-            <w:proofErr w:type="spellEnd"/>
-            <w:r>
-              <w:t xml:space="preserve"> </w:t>
-            </w:r>
-            <w:proofErr w:type="spellStart"/>
-            <w:r>
-              <w:t>că</w:t>
-            </w:r>
-            <w:proofErr w:type="spellEnd"/>
-            <w:r>
-              <w:t xml:space="preserve"> </w:t>
-            </w:r>
-            <w:proofErr w:type="spellStart"/>
-            <w:r>
-              <w:t>operațiile</w:t>
-            </w:r>
-            <w:proofErr w:type="spellEnd"/>
-            <w:r>
-              <w:t xml:space="preserve"> </w:t>
-            </w:r>
-            <w:proofErr w:type="spellStart"/>
-            <w:r>
-              <w:t>logice</w:t>
-            </w:r>
-            <w:proofErr w:type="spellEnd"/>
-            <w:r>
-              <w:t xml:space="preserve"> se pot </w:t>
-            </w:r>
-            <w:proofErr w:type="spellStart"/>
-            <w:r>
-              <w:t>realiza</w:t>
-            </w:r>
-            <w:proofErr w:type="spellEnd"/>
-            <w:r>
-              <w:t xml:space="preserve"> direct pe </w:t>
-            </w:r>
-            <w:proofErr w:type="spellStart"/>
-            <w:r>
-              <w:t>indecși</w:t>
-            </w:r>
-            <w:proofErr w:type="spellEnd"/>
-            <w:r>
-              <w:t xml:space="preserve">, </w:t>
-            </w:r>
-            <w:proofErr w:type="spellStart"/>
-            <w:r>
-              <w:t>fără</w:t>
-            </w:r>
-            <w:proofErr w:type="spellEnd"/>
-            <w:r>
-              <w:t xml:space="preserve"> a </w:t>
-            </w:r>
-            <w:proofErr w:type="spellStart"/>
-            <w:r>
-              <w:t>mai</w:t>
-            </w:r>
-            <w:proofErr w:type="spellEnd"/>
-            <w:r>
-              <w:t xml:space="preserve"> fi </w:t>
-            </w:r>
-            <w:proofErr w:type="spellStart"/>
-            <w:r>
-              <w:t>nevoie</w:t>
-            </w:r>
-            <w:proofErr w:type="spellEnd"/>
-            <w:r>
-              <w:t xml:space="preserve"> </w:t>
-            </w:r>
-            <w:proofErr w:type="spellStart"/>
-            <w:r>
-              <w:t>să</w:t>
-            </w:r>
-            <w:proofErr w:type="spellEnd"/>
-            <w:r>
-              <w:t xml:space="preserve"> se </w:t>
-            </w:r>
-            <w:proofErr w:type="spellStart"/>
-            <w:r>
-              <w:t>acceseze</w:t>
-            </w:r>
-            <w:proofErr w:type="spellEnd"/>
-            <w:r>
-              <w:t xml:space="preserve"> </w:t>
-            </w:r>
-            <w:proofErr w:type="spellStart"/>
-            <w:r>
-              <w:t>tabelul</w:t>
-            </w:r>
-            <w:proofErr w:type="spellEnd"/>
-            <w:r>
-              <w:t>.</w:t>
-            </w:r>
-          </w:p>
-          <w:p>
-            <w:pPr>
-              <w:jc w:val="both"/>
-              <w:rPr>
-                <w:lang w:val="ro-RO"/>
-              </w:rPr>
-            </w:pPr>
-          </w:p>
-        </w:tc>
-        <w:tc>
-          <w:tcPr>
-            <w:tcW w:w="5508" w:type="dxa"/>
-          </w:tcPr>
-          <w:p>
-            <w:pPr>
-              <w:jc w:val="both"/>
-              <w:rPr>
-                <w:lang w:val="ro-RO"/>
-              </w:rPr>
-            </w:pPr>
-          </w:p>
-          <w:p>
-            <w:pPr>
-              <w:jc w:val="both"/>
-              <w:rPr>
-                <w:lang w:val="ro-RO"/>
-              </w:rPr>
-            </w:pPr>
-            <w:r>
-              <w:rPr>
-                <w:lang w:val="ro-RO"/>
-              </w:rPr>
-              <w:t>O</w:t>
-            </w:r>
-            <w:proofErr w:type="spellStart"/>
-            <w:r>
-              <w:rPr>
-                <w:lang w:val="es-ES"/>
-              </w:rPr>
-              <w:t>cupă</w:t>
-            </w:r>
-            <w:proofErr w:type="spellEnd"/>
-            <w:r>
-              <w:rPr>
-                <w:lang w:val="es-ES"/>
-              </w:rPr>
-              <w:t xml:space="preserve"> </w:t>
-            </w:r>
-            <w:proofErr w:type="spellStart"/>
-            <w:r>
-              <w:rPr>
-                <w:lang w:val="es-ES"/>
-              </w:rPr>
-              <w:t>spațiu</w:t>
-            </w:r>
-            <w:proofErr w:type="spellEnd"/>
-            <w:r>
-              <w:rPr>
-                <w:lang w:val="es-ES"/>
-              </w:rPr>
-              <w:t xml:space="preserve"> </w:t>
-            </w:r>
-            <w:proofErr w:type="spellStart"/>
-            <w:r>
-              <w:rPr>
-                <w:lang w:val="es-ES"/>
-              </w:rPr>
-              <w:t>suplimentar</w:t>
-            </w:r>
-            <w:proofErr w:type="spellEnd"/>
-            <w:r>
-              <w:rPr>
-                <w:lang w:val="es-ES"/>
-              </w:rPr>
-              <w:t xml:space="preserve"> </w:t>
-            </w:r>
-            <w:proofErr w:type="spellStart"/>
-            <w:r>
-              <w:rPr>
-                <w:lang w:val="es-ES"/>
-              </w:rPr>
-              <w:t>și</w:t>
-            </w:r>
-            <w:proofErr w:type="spellEnd"/>
-            <w:r>
-              <w:rPr>
-                <w:lang w:val="es-ES"/>
-              </w:rPr>
-              <w:t xml:space="preserve"> </w:t>
-            </w:r>
-            <w:proofErr w:type="spellStart"/>
-            <w:r>
-              <w:rPr>
-                <w:lang w:val="es-ES"/>
-              </w:rPr>
-              <w:t>inserțiile</w:t>
-            </w:r>
-            <w:proofErr w:type="spellEnd"/>
-            <w:r>
-              <w:rPr>
-                <w:lang w:val="es-ES"/>
-              </w:rPr>
-              <w:t>/</w:t>
-            </w:r>
-            <w:proofErr w:type="spellStart"/>
-            <w:r>
-              <w:rPr>
-                <w:lang w:val="es-ES"/>
-              </w:rPr>
-              <w:t>actualizările</w:t>
-            </w:r>
-            <w:proofErr w:type="spellEnd"/>
-            <w:r>
-              <w:rPr>
-                <w:lang w:val="es-ES"/>
-              </w:rPr>
-              <w:t xml:space="preserve"> </w:t>
-            </w:r>
-            <w:proofErr w:type="spellStart"/>
-            <w:r>
-              <w:rPr>
-                <w:lang w:val="es-ES"/>
-              </w:rPr>
-              <w:t>pot</w:t>
-            </w:r>
-            <w:proofErr w:type="spellEnd"/>
-            <w:r>
-              <w:rPr>
-                <w:lang w:val="es-ES"/>
-              </w:rPr>
-              <w:t xml:space="preserve"> fi </w:t>
-            </w:r>
-            <w:proofErr w:type="spellStart"/>
-            <w:r>
-              <w:rPr>
-                <w:lang w:val="es-ES"/>
-              </w:rPr>
-              <w:t>mai</w:t>
-            </w:r>
-            <w:proofErr w:type="spellEnd"/>
-            <w:r>
-              <w:rPr>
-                <w:lang w:val="es-ES"/>
-              </w:rPr>
-              <w:t xml:space="preserve"> lente.</w:t>
-            </w:r>
-          </w:p>
-        </w:tc>
-      </w:tr>
-    </w:tbl>
-    <w:p>
-      <w:pPr>
-        <w:tabs>
-          <w:tab w:val="left" w:pos="2206"/>
-        </w:tabs>
-        <w:rPr>
-          <w:rFonts w:cstheme="minorHAnsi"/>
-          <w:lang w:val="ro-RO"/>
-        </w:rPr>
-      </w:pPr>
+        <w:rPr>
+          <w:b/>
+          <w:bCs/>
+        </w:rPr>
+      </w:pPr>
+      <w:r>
+        <w:tab/>
+      </w:r>
+      <w:proofErr w:type="spellStart"/>
+      <w:r>
+        <w:rPr>
+          <w:rFonts w:ascii="Calibri" w:eastAsia="Calibri" w:hAnsi="Calibri" w:cs="Calibri"/>
+          <w:b/>
+          <w:bCs/>
+        </w:rPr>
+        <w:t>Grafic</w:t>
+      </w:r>
+      <w:proofErr w:type="spellEnd"/>
+      <w:r>
+        <w:rPr>
+          <w:rFonts w:ascii="Calibri" w:eastAsia="Calibri" w:hAnsi="Calibri" w:cs="Calibri"/>
+          <w:b/>
+          <w:bCs/>
+        </w:rPr>
+        <w:t xml:space="preserve">: </w:t>
+      </w:r>
+      <w:proofErr w:type="spellStart"/>
+      <w:r>
+        <w:rPr>
+          <w:rFonts w:ascii="Calibri" w:eastAsia="Calibri" w:hAnsi="Calibri" w:cs="Calibri"/>
+          <w:b/>
+          <w:bCs/>
+        </w:rPr>
+        <w:t>Distribuția</w:t>
+      </w:r>
+      <w:proofErr w:type="spellEnd"/>
+      <w:r>
+        <w:rPr>
+          <w:rFonts w:ascii="Calibri" w:eastAsia="Calibri" w:hAnsi="Calibri" w:cs="Calibri"/>
+          <w:b/>
+          <w:bCs/>
+        </w:rPr>
+        <w:t xml:space="preserve"> </w:t>
+      </w:r>
+      <w:proofErr w:type="spellStart"/>
+      <w:r>
+        <w:rPr>
+          <w:rFonts w:ascii="Calibri" w:eastAsia="Calibri" w:hAnsi="Calibri" w:cs="Calibri"/>
+          <w:b/>
+          <w:bCs/>
+        </w:rPr>
+        <w:t>tipurilor</w:t>
+      </w:r>
+      <w:proofErr w:type="spellEnd"/>
+      <w:r>
+        <w:rPr>
+          <w:rFonts w:ascii="Calibri" w:eastAsia="Calibri" w:hAnsi="Calibri" w:cs="Calibri"/>
+          <w:b/>
+          <w:bCs/>
+        </w:rPr>
+        <w:t xml:space="preserve"> de </w:t>
+      </w:r>
+      <w:proofErr w:type="spellStart"/>
+      <w:r>
+        <w:rPr>
+          <w:rFonts w:ascii="Calibri" w:eastAsia="Calibri" w:hAnsi="Calibri" w:cs="Calibri"/>
+          <w:b/>
+          <w:bCs/>
+        </w:rPr>
+        <w:t>cameră</w:t>
+      </w:r>
+      <w:proofErr w:type="spellEnd"/>
+      <w:r>
+        <w:rPr>
+          <w:rFonts w:ascii="Calibri" w:eastAsia="Calibri" w:hAnsi="Calibri" w:cs="Calibri"/>
+          <w:b/>
+          <w:bCs/>
+        </w:rPr>
+        <w:t xml:space="preserve"> </w:t>
+      </w:r>
+      <w:proofErr w:type="spellStart"/>
+      <w:r>
+        <w:rPr>
+          <w:rFonts w:ascii="Calibri" w:eastAsia="Calibri" w:hAnsi="Calibri" w:cs="Calibri"/>
+          <w:b/>
+          <w:bCs/>
+        </w:rPr>
+        <w:t>pentru</w:t>
+      </w:r>
+      <w:proofErr w:type="spellEnd"/>
+      <w:r>
+        <w:rPr>
+          <w:rFonts w:ascii="Calibri" w:eastAsia="Calibri" w:hAnsi="Calibri" w:cs="Calibri"/>
+          <w:b/>
+          <w:bCs/>
+        </w:rPr>
+        <w:t xml:space="preserve"> </w:t>
+      </w:r>
+      <w:proofErr w:type="spellStart"/>
+      <w:r>
+        <w:rPr>
+          <w:rFonts w:ascii="Calibri" w:eastAsia="Calibri" w:hAnsi="Calibri" w:cs="Calibri"/>
+          <w:b/>
+          <w:bCs/>
+        </w:rPr>
+        <w:t>clienții</w:t>
+      </w:r>
+      <w:proofErr w:type="spellEnd"/>
+      <w:r>
+        <w:rPr>
+          <w:rFonts w:ascii="Calibri" w:eastAsia="Calibri" w:hAnsi="Calibri" w:cs="Calibri"/>
+          <w:b/>
+          <w:bCs/>
+        </w:rPr>
+        <w:t xml:space="preserve"> VIP (Pie Chart)</w:t>
+      </w:r>
     </w:p>
     <w:p>
       <w:pPr>
-        <w:numPr>
-          <w:ilvl w:val="0"/>
-          <w:numId w:val="12"/>
-        </w:numPr>
-        <w:rPr>
-          <w:rFonts w:cstheme="minorHAnsi"/>
-        </w:rPr>
-      </w:pPr>
-      <w:r>
-        <w:rPr>
-          <w:rFonts w:cstheme="minorHAnsi"/>
-          <w:b/>
-          <w:bCs/>
+        <w:ind w:firstLine="720"/>
+        <w:jc w:val="both"/>
+        <w:rPr>
+          <w:b/>
+          <w:bCs/>
+        </w:rPr>
+      </w:pPr>
+      <w:r>
+        <w:rPr>
+          <w:b/>
+          <w:bCs/>
+        </w:rPr>
+        <w:t xml:space="preserve">Scop: </w:t>
+      </w:r>
+      <w:proofErr w:type="spellStart"/>
+      <w:r>
+        <w:t>Să</w:t>
+      </w:r>
+      <w:proofErr w:type="spellEnd"/>
+      <w:r>
+        <w:t xml:space="preserve"> </w:t>
+      </w:r>
+      <w:proofErr w:type="spellStart"/>
+      <w:r>
+        <w:t>arate</w:t>
+      </w:r>
+      <w:proofErr w:type="spellEnd"/>
+      <w:r>
+        <w:t xml:space="preserve"> </w:t>
+      </w:r>
+      <w:proofErr w:type="spellStart"/>
+      <w:r>
+        <w:t>ponderea</w:t>
+      </w:r>
+      <w:proofErr w:type="spellEnd"/>
+      <w:r>
+        <w:t xml:space="preserve"> </w:t>
+      </w:r>
+      <w:proofErr w:type="spellStart"/>
+      <w:r>
+        <w:t>fiecărei</w:t>
+      </w:r>
+      <w:proofErr w:type="spellEnd"/>
+      <w:r>
+        <w:t xml:space="preserve"> </w:t>
+      </w:r>
+      <w:proofErr w:type="spellStart"/>
+      <w:r>
+        <w:t>categorii</w:t>
+      </w:r>
+      <w:proofErr w:type="spellEnd"/>
+      <w:r>
+        <w:t xml:space="preserve"> de </w:t>
+      </w:r>
+      <w:proofErr w:type="spellStart"/>
+      <w:r>
+        <w:t>cameră</w:t>
+      </w:r>
+      <w:proofErr w:type="spellEnd"/>
+      <w:r>
+        <w:t xml:space="preserve"> din </w:t>
+      </w:r>
+      <w:proofErr w:type="spellStart"/>
+      <w:r>
+        <w:t>totalul</w:t>
+      </w:r>
+      <w:proofErr w:type="spellEnd"/>
+      <w:r>
+        <w:t xml:space="preserve"> </w:t>
+      </w:r>
+      <w:proofErr w:type="spellStart"/>
+      <w:r>
+        <w:t>rezervărilor</w:t>
+      </w:r>
+      <w:proofErr w:type="spellEnd"/>
+      <w:r>
+        <w:t xml:space="preserve"> </w:t>
+      </w:r>
+      <w:proofErr w:type="spellStart"/>
+      <w:r>
+        <w:t>efectuate</w:t>
+      </w:r>
+      <w:proofErr w:type="spellEnd"/>
+      <w:r>
+        <w:t xml:space="preserve"> de</w:t>
+      </w:r>
+      <w:r>
+        <w:t xml:space="preserve"> </w:t>
+      </w:r>
+      <w:r>
+        <w:rPr>
           <w:lang w:val="ro-RO"/>
         </w:rPr>
-        <w:t xml:space="preserve">(2p) </w:t>
-      </w:r>
-      <w:r>
-        <w:rPr>
-          <w:rFonts w:cstheme="minorHAnsi"/>
-          <w:lang w:val="ro-RO"/>
-        </w:rPr>
-        <w:t>Formularea în limbaj natural a cel puțin 5 cereri, specifice DW, cu grad de</w:t>
-      </w:r>
-      <w:r>
-        <w:rPr>
-          <w:rFonts w:cstheme="minorHAnsi"/>
-        </w:rPr>
-        <w:t> </w:t>
+        <w:t>către</w:t>
+      </w:r>
+      <w:r>
+        <w:t xml:space="preserve"> </w:t>
+      </w:r>
+      <w:proofErr w:type="spellStart"/>
+      <w:r>
+        <w:t>clienții</w:t>
+      </w:r>
+      <w:proofErr w:type="spellEnd"/>
+      <w:r>
+        <w:t xml:space="preserve"> VIP.</w:t>
       </w:r>
     </w:p>
     <w:p>
       <w:pPr>
+        <w:ind w:left="720"/>
+        <w:jc w:val="both"/>
+      </w:pPr>
+      <w:proofErr w:type="spellStart"/>
+      <w:r>
+        <w:rPr>
+          <w:b/>
+          <w:bCs/>
+        </w:rPr>
+        <w:t>Reprezentare</w:t>
+      </w:r>
+      <w:proofErr w:type="spellEnd"/>
+      <w:r>
+        <w:rPr>
+          <w:b/>
+          <w:bCs/>
+        </w:rPr>
+        <w:t xml:space="preserve">: </w:t>
+      </w:r>
+      <w:proofErr w:type="spellStart"/>
+      <w:r>
+        <w:t>Diagramă</w:t>
+      </w:r>
+      <w:proofErr w:type="spellEnd"/>
+      <w:r>
+        <w:t xml:space="preserve"> </w:t>
+      </w:r>
+      <w:proofErr w:type="spellStart"/>
+      <w:r>
+        <w:t>circulară</w:t>
+      </w:r>
+      <w:proofErr w:type="spellEnd"/>
+      <w:r>
+        <w:t xml:space="preserve"> </w:t>
+      </w:r>
+      <w:proofErr w:type="spellStart"/>
+      <w:r>
+        <w:t>în</w:t>
+      </w:r>
+      <w:proofErr w:type="spellEnd"/>
+      <w:r>
+        <w:t xml:space="preserve"> care </w:t>
+      </w:r>
+      <w:proofErr w:type="spellStart"/>
+      <w:r>
+        <w:t>fiecare</w:t>
+      </w:r>
+      <w:proofErr w:type="spellEnd"/>
+      <w:r>
+        <w:t xml:space="preserve"> sector (</w:t>
+      </w:r>
+      <w:proofErr w:type="spellStart"/>
+      <w:r>
+        <w:t>felie</w:t>
+      </w:r>
+      <w:proofErr w:type="spellEnd"/>
+      <w:r>
+        <w:t xml:space="preserve">) </w:t>
+      </w:r>
+      <w:proofErr w:type="spellStart"/>
+      <w:r>
+        <w:t>corespunde</w:t>
+      </w:r>
+      <w:proofErr w:type="spellEnd"/>
+      <w:r>
+        <w:t xml:space="preserve"> unui tip de </w:t>
+      </w:r>
+      <w:proofErr w:type="spellStart"/>
+      <w:r>
+        <w:t>cameră</w:t>
+      </w:r>
+      <w:proofErr w:type="spellEnd"/>
+      <w:r>
+        <w:t xml:space="preserve">, </w:t>
+      </w:r>
+      <w:proofErr w:type="spellStart"/>
+      <w:r>
+        <w:t>dimensiunea</w:t>
+      </w:r>
+      <w:proofErr w:type="spellEnd"/>
+      <w:r>
+        <w:t xml:space="preserve"> </w:t>
+      </w:r>
+      <w:proofErr w:type="spellStart"/>
+      <w:r>
+        <w:t>acestuia</w:t>
+      </w:r>
+      <w:proofErr w:type="spellEnd"/>
+      <w:r>
+        <w:t xml:space="preserve"> </w:t>
+      </w:r>
+      <w:proofErr w:type="spellStart"/>
+      <w:r>
+        <w:t>fiind</w:t>
+      </w:r>
+      <w:proofErr w:type="spellEnd"/>
+      <w:r>
+        <w:t xml:space="preserve"> direct </w:t>
+      </w:r>
+      <w:proofErr w:type="spellStart"/>
+      <w:r>
+        <w:t>proporțională</w:t>
+      </w:r>
+      <w:proofErr w:type="spellEnd"/>
+      <w:r>
+        <w:t xml:space="preserve"> cu </w:t>
+      </w:r>
+      <w:proofErr w:type="spellStart"/>
+      <w:r>
+        <w:t>numărul</w:t>
+      </w:r>
+      <w:proofErr w:type="spellEnd"/>
+      <w:r>
+        <w:t xml:space="preserve"> de </w:t>
+      </w:r>
+      <w:proofErr w:type="spellStart"/>
+      <w:r>
+        <w:t>rezervări</w:t>
+      </w:r>
+      <w:proofErr w:type="spellEnd"/>
+      <w:r>
+        <w:t>.</w:t>
+      </w:r>
+    </w:p>
+    <w:p>
+      <w:pPr>
         <w:ind w:firstLine="360"/>
         <w:rPr>
           <w:rFonts w:cstheme="minorHAnsi"/>
         </w:rPr>
       </w:pPr>
-      <w:r>
-        <w:rPr>
-          <w:rFonts w:cstheme="minorHAnsi"/>
-          <w:lang w:val="ro-RO"/>
-        </w:rPr>
-        <w:t>complexitate diferit, concretizate în rapoarte (grafice) ce vor fi create în următoarele etape.</w:t>
-      </w:r>
-      <w:r>
-        <w:rPr>
-          <w:rFonts w:cstheme="minorHAnsi"/>
-        </w:rPr>
-        <w:t> </w:t>
-      </w:r>
     </w:p>
     <w:p>
       <w:pPr>
@@ -9490,6 +11202,96 @@
     </w:lvl>
   </w:abstractNum>
   <w:abstractNum w:abstractNumId="20" w15:restartNumberingAfterBreak="0">
+    <w:nsid w:val="4C761F57"/>
+    <w:multiLevelType w:val="multilevel"/>
+    <w:tmpl w:val="EF36A1BE"/>
+    <w:lvl w:ilvl="0">
+      <w:start w:val="10"/>
+      <w:numFmt w:val="decimal"/>
+      <w:lvlText w:val="%1."/>
+      <w:lvlJc w:val="left"/>
+      <w:pPr>
+        <w:ind w:left="720" w:hanging="360"/>
+      </w:pPr>
+    </w:lvl>
+    <w:lvl w:ilvl="1">
+      <w:start w:val="1"/>
+      <w:numFmt w:val="decimal"/>
+      <w:lvlText w:val="%2."/>
+      <w:lvlJc w:val="left"/>
+      <w:pPr>
+        <w:ind w:left="1352" w:hanging="360"/>
+      </w:pPr>
+      <w:rPr>
+        <w:b/>
+        <w:bCs/>
+      </w:rPr>
+    </w:lvl>
+    <w:lvl w:ilvl="2">
+      <w:start w:val="1"/>
+      <w:numFmt w:val="decimal"/>
+      <w:lvlText w:val="%3."/>
+      <w:lvlJc w:val="left"/>
+      <w:pPr>
+        <w:ind w:left="1352" w:hanging="360"/>
+      </w:pPr>
+    </w:lvl>
+    <w:lvl w:ilvl="3">
+      <w:start w:val="1"/>
+      <w:numFmt w:val="decimal"/>
+      <w:lvlText w:val="%4."/>
+      <w:lvlJc w:val="left"/>
+      <w:pPr>
+        <w:ind w:left="2880" w:hanging="360"/>
+      </w:pPr>
+    </w:lvl>
+    <w:lvl w:ilvl="4">
+      <w:start w:val="1"/>
+      <w:numFmt w:val="decimal"/>
+      <w:lvlText w:val="%5."/>
+      <w:lvlJc w:val="left"/>
+      <w:pPr>
+        <w:ind w:left="3600" w:hanging="360"/>
+      </w:pPr>
+    </w:lvl>
+    <w:lvl w:ilvl="5">
+      <w:start w:val="1"/>
+      <w:numFmt w:val="decimal"/>
+      <w:lvlText w:val="%6."/>
+      <w:lvlJc w:val="left"/>
+      <w:pPr>
+        <w:ind w:left="4320" w:hanging="360"/>
+      </w:pPr>
+    </w:lvl>
+    <w:lvl w:ilvl="6">
+      <w:start w:val="1"/>
+      <w:numFmt w:val="decimal"/>
+      <w:lvlText w:val="%7."/>
+      <w:lvlJc w:val="left"/>
+      <w:pPr>
+        <w:ind w:left="5040" w:hanging="360"/>
+      </w:pPr>
+    </w:lvl>
+    <w:lvl w:ilvl="7">
+      <w:start w:val="1"/>
+      <w:numFmt w:val="decimal"/>
+      <w:lvlText w:val="%8."/>
+      <w:lvlJc w:val="left"/>
+      <w:pPr>
+        <w:ind w:left="5760" w:hanging="360"/>
+      </w:pPr>
+    </w:lvl>
+    <w:lvl w:ilvl="8">
+      <w:start w:val="1"/>
+      <w:numFmt w:val="decimal"/>
+      <w:lvlText w:val="%9."/>
+      <w:lvlJc w:val="left"/>
+      <w:pPr>
+        <w:ind w:left="6480" w:hanging="360"/>
+      </w:pPr>
+    </w:lvl>
+  </w:abstractNum>
+  <w:abstractNum w:abstractNumId="21" w15:restartNumberingAfterBreak="0">
     <w:nsid w:val="53215195"/>
     <w:multiLevelType w:val="multilevel"/>
     <w:tmpl w:val="2B9C6152"/>
@@ -9638,7 +11440,120 @@
       </w:rPr>
     </w:lvl>
   </w:abstractNum>
-  <w:abstractNum w:abstractNumId="21" w15:restartNumberingAfterBreak="0">
+  <w:abstractNum w:abstractNumId="22" w15:restartNumberingAfterBreak="0">
+    <w:nsid w:val="55B25B25"/>
+    <w:multiLevelType w:val="hybridMultilevel"/>
+    <w:tmpl w:val="B9F0C132"/>
+    <w:lvl w:ilvl="0" w:tplc="04090001">
+      <w:start w:val="1"/>
+      <w:numFmt w:val="bullet"/>
+      <w:lvlText w:val=""/>
+      <w:lvlJc w:val="left"/>
+      <w:pPr>
+        <w:ind w:left="720" w:hanging="360"/>
+      </w:pPr>
+      <w:rPr>
+        <w:rFonts w:ascii="Symbol" w:hAnsi="Symbol" w:hint="default"/>
+      </w:rPr>
+    </w:lvl>
+    <w:lvl w:ilvl="1" w:tplc="04090003" w:tentative="1">
+      <w:start w:val="1"/>
+      <w:numFmt w:val="bullet"/>
+      <w:lvlText w:val="o"/>
+      <w:lvlJc w:val="left"/>
+      <w:pPr>
+        <w:ind w:left="1440" w:hanging="360"/>
+      </w:pPr>
+      <w:rPr>
+        <w:rFonts w:ascii="Courier New" w:hAnsi="Courier New" w:cs="Courier New" w:hint="default"/>
+      </w:rPr>
+    </w:lvl>
+    <w:lvl w:ilvl="2" w:tplc="04090005" w:tentative="1">
+      <w:start w:val="1"/>
+      <w:numFmt w:val="bullet"/>
+      <w:lvlText w:val=""/>
+      <w:lvlJc w:val="left"/>
+      <w:pPr>
+        <w:ind w:left="2160" w:hanging="360"/>
+      </w:pPr>
+      <w:rPr>
+        <w:rFonts w:ascii="Wingdings" w:hAnsi="Wingdings" w:hint="default"/>
+      </w:rPr>
+    </w:lvl>
+    <w:lvl w:ilvl="3" w:tplc="04090001" w:tentative="1">
+      <w:start w:val="1"/>
+      <w:numFmt w:val="bullet"/>
+      <w:lvlText w:val=""/>
+      <w:lvlJc w:val="left"/>
+      <w:pPr>
+        <w:ind w:left="2880" w:hanging="360"/>
+      </w:pPr>
+      <w:rPr>
+        <w:rFonts w:ascii="Symbol" w:hAnsi="Symbol" w:hint="default"/>
+      </w:rPr>
+    </w:lvl>
+    <w:lvl w:ilvl="4" w:tplc="04090003" w:tentative="1">
+      <w:start w:val="1"/>
+      <w:numFmt w:val="bullet"/>
+      <w:lvlText w:val="o"/>
+      <w:lvlJc w:val="left"/>
+      <w:pPr>
+        <w:ind w:left="3600" w:hanging="360"/>
+      </w:pPr>
+      <w:rPr>
+        <w:rFonts w:ascii="Courier New" w:hAnsi="Courier New" w:cs="Courier New" w:hint="default"/>
+      </w:rPr>
+    </w:lvl>
+    <w:lvl w:ilvl="5" w:tplc="04090005" w:tentative="1">
+      <w:start w:val="1"/>
+      <w:numFmt w:val="bullet"/>
+      <w:lvlText w:val=""/>
+      <w:lvlJc w:val="left"/>
+      <w:pPr>
+        <w:ind w:left="4320" w:hanging="360"/>
+      </w:pPr>
+      <w:rPr>
+        <w:rFonts w:ascii="Wingdings" w:hAnsi="Wingdings" w:hint="default"/>
+      </w:rPr>
+    </w:lvl>
+    <w:lvl w:ilvl="6" w:tplc="04090001" w:tentative="1">
+      <w:start w:val="1"/>
+      <w:numFmt w:val="bullet"/>
+      <w:lvlText w:val=""/>
+      <w:lvlJc w:val="left"/>
+      <w:pPr>
+        <w:ind w:left="5040" w:hanging="360"/>
+      </w:pPr>
+      <w:rPr>
+        <w:rFonts w:ascii="Symbol" w:hAnsi="Symbol" w:hint="default"/>
+      </w:rPr>
+    </w:lvl>
+    <w:lvl w:ilvl="7" w:tplc="04090003" w:tentative="1">
+      <w:start w:val="1"/>
+      <w:numFmt w:val="bullet"/>
+      <w:lvlText w:val="o"/>
+      <w:lvlJc w:val="left"/>
+      <w:pPr>
+        <w:ind w:left="5760" w:hanging="360"/>
+      </w:pPr>
+      <w:rPr>
+        <w:rFonts w:ascii="Courier New" w:hAnsi="Courier New" w:cs="Courier New" w:hint="default"/>
+      </w:rPr>
+    </w:lvl>
+    <w:lvl w:ilvl="8" w:tplc="04090005" w:tentative="1">
+      <w:start w:val="1"/>
+      <w:numFmt w:val="bullet"/>
+      <w:lvlText w:val=""/>
+      <w:lvlJc w:val="left"/>
+      <w:pPr>
+        <w:ind w:left="6480" w:hanging="360"/>
+      </w:pPr>
+      <w:rPr>
+        <w:rFonts w:ascii="Wingdings" w:hAnsi="Wingdings" w:hint="default"/>
+      </w:rPr>
+    </w:lvl>
+  </w:abstractNum>
+  <w:abstractNum w:abstractNumId="23" w15:restartNumberingAfterBreak="0">
     <w:nsid w:val="567C160E"/>
     <w:multiLevelType w:val="multilevel"/>
     <w:tmpl w:val="77E0515E"/>
@@ -9751,7 +11666,7 @@
       </w:pPr>
     </w:lvl>
   </w:abstractNum>
-  <w:abstractNum w:abstractNumId="22" w15:restartNumberingAfterBreak="0">
+  <w:abstractNum w:abstractNumId="24" w15:restartNumberingAfterBreak="0">
     <w:nsid w:val="576E6663"/>
     <w:multiLevelType w:val="multilevel"/>
     <w:tmpl w:val="43F6A580"/>
@@ -9900,7 +11815,7 @@
       </w:rPr>
     </w:lvl>
   </w:abstractNum>
-  <w:abstractNum w:abstractNumId="23" w15:restartNumberingAfterBreak="0">
+  <w:abstractNum w:abstractNumId="25" w15:restartNumberingAfterBreak="0">
     <w:nsid w:val="599F70D1"/>
     <w:multiLevelType w:val="multilevel"/>
     <w:tmpl w:val="B5D2B33A"/>
@@ -9986,7 +11901,7 @@
       </w:pPr>
     </w:lvl>
   </w:abstractNum>
-  <w:abstractNum w:abstractNumId="24" w15:restartNumberingAfterBreak="0">
+  <w:abstractNum w:abstractNumId="26" w15:restartNumberingAfterBreak="0">
     <w:nsid w:val="63811952"/>
     <w:multiLevelType w:val="multilevel"/>
     <w:tmpl w:val="2C3E8DA4"/>
@@ -10099,7 +12014,7 @@
       </w:pPr>
     </w:lvl>
   </w:abstractNum>
-  <w:abstractNum w:abstractNumId="25" w15:restartNumberingAfterBreak="0">
+  <w:abstractNum w:abstractNumId="27" w15:restartNumberingAfterBreak="0">
     <w:nsid w:val="6A2E468E"/>
     <w:multiLevelType w:val="hybridMultilevel"/>
     <w:tmpl w:val="15269C48"/>
@@ -10185,7 +12100,7 @@
       </w:pPr>
     </w:lvl>
   </w:abstractNum>
-  <w:abstractNum w:abstractNumId="26" w15:restartNumberingAfterBreak="0">
+  <w:abstractNum w:abstractNumId="28" w15:restartNumberingAfterBreak="0">
     <w:nsid w:val="6AAC0EFD"/>
     <w:multiLevelType w:val="multilevel"/>
     <w:tmpl w:val="AFBA03A6"/>
@@ -10298,7 +12213,156 @@
       </w:pPr>
     </w:lvl>
   </w:abstractNum>
-  <w:abstractNum w:abstractNumId="27" w15:restartNumberingAfterBreak="0">
+  <w:abstractNum w:abstractNumId="29" w15:restartNumberingAfterBreak="0">
+    <w:nsid w:val="6E021CB4"/>
+    <w:multiLevelType w:val="multilevel"/>
+    <w:tmpl w:val="AC9C8B48"/>
+    <w:lvl w:ilvl="0">
+      <w:start w:val="1"/>
+      <w:numFmt w:val="bullet"/>
+      <w:lvlText w:val=""/>
+      <w:lvlJc w:val="left"/>
+      <w:pPr>
+        <w:tabs>
+          <w:tab w:val="num" w:pos="720"/>
+        </w:tabs>
+        <w:ind w:left="720" w:hanging="360"/>
+      </w:pPr>
+      <w:rPr>
+        <w:rFonts w:ascii="Symbol" w:hAnsi="Symbol" w:hint="default"/>
+        <w:sz w:val="20"/>
+      </w:rPr>
+    </w:lvl>
+    <w:lvl w:ilvl="1">
+      <w:start w:val="1"/>
+      <w:numFmt w:val="bullet"/>
+      <w:lvlText w:val="o"/>
+      <w:lvlJc w:val="left"/>
+      <w:pPr>
+        <w:tabs>
+          <w:tab w:val="num" w:pos="1440"/>
+        </w:tabs>
+        <w:ind w:left="1440" w:hanging="360"/>
+      </w:pPr>
+      <w:rPr>
+        <w:rFonts w:ascii="Courier New" w:hAnsi="Courier New" w:hint="default"/>
+        <w:sz w:val="20"/>
+      </w:rPr>
+    </w:lvl>
+    <w:lvl w:ilvl="2" w:tentative="1">
+      <w:start w:val="1"/>
+      <w:numFmt w:val="bullet"/>
+      <w:lvlText w:val=""/>
+      <w:lvlJc w:val="left"/>
+      <w:pPr>
+        <w:tabs>
+          <w:tab w:val="num" w:pos="2160"/>
+        </w:tabs>
+        <w:ind w:left="2160" w:hanging="360"/>
+      </w:pPr>
+      <w:rPr>
+        <w:rFonts w:ascii="Wingdings" w:hAnsi="Wingdings" w:hint="default"/>
+        <w:sz w:val="20"/>
+      </w:rPr>
+    </w:lvl>
+    <w:lvl w:ilvl="3" w:tentative="1">
+      <w:start w:val="1"/>
+      <w:numFmt w:val="bullet"/>
+      <w:lvlText w:val=""/>
+      <w:lvlJc w:val="left"/>
+      <w:pPr>
+        <w:tabs>
+          <w:tab w:val="num" w:pos="2880"/>
+        </w:tabs>
+        <w:ind w:left="2880" w:hanging="360"/>
+      </w:pPr>
+      <w:rPr>
+        <w:rFonts w:ascii="Wingdings" w:hAnsi="Wingdings" w:hint="default"/>
+        <w:sz w:val="20"/>
+      </w:rPr>
+    </w:lvl>
+    <w:lvl w:ilvl="4" w:tentative="1">
+      <w:start w:val="1"/>
+      <w:numFmt w:val="bullet"/>
+      <w:lvlText w:val=""/>
+      <w:lvlJc w:val="left"/>
+      <w:pPr>
+        <w:tabs>
+          <w:tab w:val="num" w:pos="3600"/>
+        </w:tabs>
+        <w:ind w:left="3600" w:hanging="360"/>
+      </w:pPr>
+      <w:rPr>
+        <w:rFonts w:ascii="Wingdings" w:hAnsi="Wingdings" w:hint="default"/>
+        <w:sz w:val="20"/>
+      </w:rPr>
+    </w:lvl>
+    <w:lvl w:ilvl="5" w:tentative="1">
+      <w:start w:val="1"/>
+      <w:numFmt w:val="bullet"/>
+      <w:lvlText w:val=""/>
+      <w:lvlJc w:val="left"/>
+      <w:pPr>
+        <w:tabs>
+          <w:tab w:val="num" w:pos="4320"/>
+        </w:tabs>
+        <w:ind w:left="4320" w:hanging="360"/>
+      </w:pPr>
+      <w:rPr>
+        <w:rFonts w:ascii="Wingdings" w:hAnsi="Wingdings" w:hint="default"/>
+        <w:sz w:val="20"/>
+      </w:rPr>
+    </w:lvl>
+    <w:lvl w:ilvl="6" w:tentative="1">
+      <w:start w:val="1"/>
+      <w:numFmt w:val="bullet"/>
+      <w:lvlText w:val=""/>
+      <w:lvlJc w:val="left"/>
+      <w:pPr>
+        <w:tabs>
+          <w:tab w:val="num" w:pos="5040"/>
+        </w:tabs>
+        <w:ind w:left="5040" w:hanging="360"/>
+      </w:pPr>
+      <w:rPr>
+        <w:rFonts w:ascii="Wingdings" w:hAnsi="Wingdings" w:hint="default"/>
+        <w:sz w:val="20"/>
+      </w:rPr>
+    </w:lvl>
+    <w:lvl w:ilvl="7" w:tentative="1">
+      <w:start w:val="1"/>
+      <w:numFmt w:val="bullet"/>
+      <w:lvlText w:val=""/>
+      <w:lvlJc w:val="left"/>
+      <w:pPr>
+        <w:tabs>
+          <w:tab w:val="num" w:pos="5760"/>
+        </w:tabs>
+        <w:ind w:left="5760" w:hanging="360"/>
+      </w:pPr>
+      <w:rPr>
+        <w:rFonts w:ascii="Wingdings" w:hAnsi="Wingdings" w:hint="default"/>
+        <w:sz w:val="20"/>
+      </w:rPr>
+    </w:lvl>
+    <w:lvl w:ilvl="8" w:tentative="1">
+      <w:start w:val="1"/>
+      <w:numFmt w:val="bullet"/>
+      <w:lvlText w:val=""/>
+      <w:lvlJc w:val="left"/>
+      <w:pPr>
+        <w:tabs>
+          <w:tab w:val="num" w:pos="6480"/>
+        </w:tabs>
+        <w:ind w:left="6480" w:hanging="360"/>
+      </w:pPr>
+      <w:rPr>
+        <w:rFonts w:ascii="Wingdings" w:hAnsi="Wingdings" w:hint="default"/>
+        <w:sz w:val="20"/>
+      </w:rPr>
+    </w:lvl>
+  </w:abstractNum>
+  <w:abstractNum w:abstractNumId="30" w15:restartNumberingAfterBreak="0">
     <w:nsid w:val="7563247C"/>
     <w:multiLevelType w:val="multilevel"/>
     <w:tmpl w:val="A94A25C2"/>
@@ -10447,7 +12511,7 @@
       </w:rPr>
     </w:lvl>
   </w:abstractNum>
-  <w:abstractNum w:abstractNumId="28" w15:restartNumberingAfterBreak="0">
+  <w:abstractNum w:abstractNumId="31" w15:restartNumberingAfterBreak="0">
     <w:nsid w:val="79214A9C"/>
     <w:multiLevelType w:val="multilevel"/>
     <w:tmpl w:val="26141A48"/>
@@ -10560,7 +12624,7 @@
       </w:pPr>
     </w:lvl>
   </w:abstractNum>
-  <w:abstractNum w:abstractNumId="29" w15:restartNumberingAfterBreak="0">
+  <w:abstractNum w:abstractNumId="32" w15:restartNumberingAfterBreak="0">
     <w:nsid w:val="7AC82061"/>
     <w:multiLevelType w:val="multilevel"/>
     <w:tmpl w:val="C5827F26"/>
@@ -10713,7 +12777,7 @@
     <w:abstractNumId w:val="6"/>
   </w:num>
   <w:num w:numId="2" w16cid:durableId="1272014729">
-    <w:abstractNumId w:val="28"/>
+    <w:abstractNumId w:val="31"/>
   </w:num>
   <w:num w:numId="3" w16cid:durableId="1907110157">
     <w:abstractNumId w:val="15"/>
@@ -10731,10 +12795,10 @@
     <w:abstractNumId w:val="2"/>
   </w:num>
   <w:num w:numId="8" w16cid:durableId="872426480">
-    <w:abstractNumId w:val="26"/>
+    <w:abstractNumId w:val="28"/>
   </w:num>
   <w:num w:numId="9" w16cid:durableId="842283275">
-    <w:abstractNumId w:val="24"/>
+    <w:abstractNumId w:val="26"/>
   </w:num>
   <w:num w:numId="10" w16cid:durableId="1703941889">
     <w:abstractNumId w:val="11"/>
@@ -10743,16 +12807,16 @@
     <w:abstractNumId w:val="16"/>
   </w:num>
   <w:num w:numId="12" w16cid:durableId="172916457">
-    <w:abstractNumId w:val="21"/>
+    <w:abstractNumId w:val="23"/>
   </w:num>
   <w:num w:numId="13" w16cid:durableId="1986860307">
-    <w:abstractNumId w:val="20"/>
+    <w:abstractNumId w:val="21"/>
   </w:num>
   <w:num w:numId="14" w16cid:durableId="1413619859">
     <w:abstractNumId w:val="14"/>
   </w:num>
   <w:num w:numId="15" w16cid:durableId="1297758594">
-    <w:abstractNumId w:val="22"/>
+    <w:abstractNumId w:val="24"/>
   </w:num>
   <w:num w:numId="16" w16cid:durableId="1453741726">
     <w:abstractNumId w:val="10"/>
@@ -10767,7 +12831,7 @@
     <w:abstractNumId w:val="17"/>
   </w:num>
   <w:num w:numId="20" w16cid:durableId="2002196968">
-    <w:abstractNumId w:val="27"/>
+    <w:abstractNumId w:val="30"/>
   </w:num>
   <w:num w:numId="21" w16cid:durableId="788553314">
     <w:abstractNumId w:val="8"/>
@@ -10785,19 +12849,28 @@
     <w:abstractNumId w:val="12"/>
   </w:num>
   <w:num w:numId="26" w16cid:durableId="546570628">
-    <w:abstractNumId w:val="29"/>
+    <w:abstractNumId w:val="32"/>
   </w:num>
   <w:num w:numId="27" w16cid:durableId="287710992">
     <w:abstractNumId w:val="7"/>
   </w:num>
   <w:num w:numId="28" w16cid:durableId="699554594">
-    <w:abstractNumId w:val="23"/>
+    <w:abstractNumId w:val="25"/>
   </w:num>
   <w:num w:numId="29" w16cid:durableId="1717925833">
     <w:abstractNumId w:val="19"/>
   </w:num>
   <w:num w:numId="30" w16cid:durableId="817402">
-    <w:abstractNumId w:val="25"/>
+    <w:abstractNumId w:val="27"/>
+  </w:num>
+  <w:num w:numId="31" w16cid:durableId="1807046462">
+    <w:abstractNumId w:val="20"/>
+  </w:num>
+  <w:num w:numId="32" w16cid:durableId="1490751167">
+    <w:abstractNumId w:val="22"/>
+  </w:num>
+  <w:num w:numId="33" w16cid:durableId="1714964440">
+    <w:abstractNumId w:val="29"/>
   </w:num>
 </w:numbering>
 </file>

</xml_diff>